<commit_message>
add disaster phase diagnostics with outputs removed
</commit_message>
<xml_diff>
--- a/literature/RQ2 - Literature Review.docx
+++ b/literature/RQ2 - Literature Review.docx
@@ -1,6 +1,6 @@
 
 <file path=word/document.xml><?xml version="1.0" encoding="utf-8"?>
-<w:document xmlns:wpc="http://schemas.microsoft.com/office/word/2010/wordprocessingCanvas" xmlns:cx="http://schemas.microsoft.com/office/drawing/2014/chartex" xmlns:cx1="http://schemas.microsoft.com/office/drawing/2015/9/8/chartex" xmlns:cx2="http://schemas.microsoft.com/office/drawing/2015/10/21/chartex" xmlns:cx3="http://schemas.microsoft.com/office/drawing/2016/5/9/chartex" xmlns:cx4="http://schemas.microsoft.com/office/drawing/2016/5/10/chartex" xmlns:cx5="http://schemas.microsoft.com/office/drawing/2016/5/11/chartex" xmlns:cx6="http://schemas.microsoft.com/office/drawing/2016/5/12/chartex" xmlns:cx7="http://schemas.microsoft.com/office/drawing/2016/5/13/chartex" xmlns:cx8="http://schemas.microsoft.com/office/drawing/2016/5/14/chartex" xmlns:mc="http://schemas.openxmlformats.org/markup-compatibility/2006" xmlns:m="http://schemas.openxmlformats.org/officeDocument/2006/math" xmlns:aink="http://schemas.microsoft.com/office/drawing/2016/ink" xmlns:am3d="http://schemas.microsoft.com/office/drawing/2017/model3d" xmlns:oel="http://schemas.microsoft.com/office/2019/extlst" xmlns:r="http://schemas.openxmlformats.org/officeDocument/2006/relationships" xmlns:wp14="http://schemas.microsoft.com/office/word/2010/wordprocessingDrawing" xmlns:wp="http://schemas.openxmlformats.org/drawingml/2006/wordprocessingDrawing" xmlns:wpg="http://schemas.microsoft.com/office/word/2010/wordprocessingGroup" xmlns:wpi="http://schemas.microsoft.com/office/word/2010/wordprocessingInk" xmlns:wps="http://schemas.microsoft.com/office/word/2010/wordprocessingShape" xmlns:o="urn:schemas-microsoft-com:office:office" xmlns:v="urn:schemas-microsoft-com:vml" xmlns:w10="urn:schemas-microsoft-com:office:word" xmlns:w="http://schemas.openxmlformats.org/wordprocessingml/2006/main" xmlns:w14="http://schemas.microsoft.com/office/word/2010/wordml" xmlns:w15="http://schemas.microsoft.com/office/word/2012/wordml" xmlns:w16cex="http://schemas.microsoft.com/office/word/2018/wordml/cex" xmlns:w16cid="http://schemas.microsoft.com/office/word/2016/wordml/cid" xmlns:w16="http://schemas.microsoft.com/office/word/2018/wordml" xmlns:w16sdtdh="http://schemas.microsoft.com/office/word/2020/wordml/sdtdatahash" xmlns:w16sdtfl="http://schemas.microsoft.com/office/word/2024/wordml/sdtformatlock" xmlns:w16se="http://schemas.microsoft.com/office/word/2015/wordml/symex" xmlns:w16du="http://schemas.microsoft.com/office/word/2023/wordml/word16du" xmlns:wne="http://schemas.microsoft.com/office/word/2006/wordml" mc:Ignorable="w14 w15 w16se w16cid w16 w16cex w16sdtdh w16sdtfl w16du wp14">
+<w:document xmlns:wpc="http://schemas.microsoft.com/office/word/2010/wordprocessingCanvas" xmlns:cx="http://schemas.microsoft.com/office/drawing/2014/chartex" xmlns:cx1="http://schemas.microsoft.com/office/drawing/2015/9/8/chartex" xmlns:cx2="http://schemas.microsoft.com/office/drawing/2015/10/21/chartex" xmlns:cx3="http://schemas.microsoft.com/office/drawing/2016/5/9/chartex" xmlns:cx4="http://schemas.microsoft.com/office/drawing/2016/5/10/chartex" xmlns:cx5="http://schemas.microsoft.com/office/drawing/2016/5/11/chartex" xmlns:cx6="http://schemas.microsoft.com/office/drawing/2016/5/12/chartex" xmlns:cx7="http://schemas.microsoft.com/office/drawing/2016/5/13/chartex" xmlns:cx8="http://schemas.microsoft.com/office/drawing/2016/5/14/chartex" xmlns:mc="http://schemas.openxmlformats.org/markup-compatibility/2006" xmlns:m="http://schemas.openxmlformats.org/officeDocument/2006/math" xmlns:aink="http://schemas.microsoft.com/office/drawing/2016/ink" xmlns:am3d="http://schemas.microsoft.com/office/drawing/2017/model3d" xmlns:oel="http://schemas.microsoft.com/office/2019/extlst" xmlns:r="http://schemas.openxmlformats.org/officeDocument/2006/relationships" xmlns:wp14="http://schemas.microsoft.com/office/word/2010/wordprocessingDrawing" xmlns:wp="http://schemas.openxmlformats.org/drawingml/2006/wordprocessingDrawing" xmlns:wpg="http://schemas.microsoft.com/office/word/2010/wordprocessingGroup" xmlns:wpi="http://schemas.microsoft.com/office/word/2010/wordprocessingInk" xmlns:wps="http://schemas.microsoft.com/office/word/2010/wordprocessingShape" xmlns:o="urn:schemas-microsoft-com:office:office" xmlns:v="urn:schemas-microsoft-com:vml" xmlns:w10="urn:schemas-microsoft-com:office:word" xmlns:w="http://schemas.openxmlformats.org/wordprocessingml/2006/main" xmlns:w14="http://schemas.microsoft.com/office/word/2010/wordml" xmlns:w15="http://schemas.microsoft.com/office/word/2012/wordml" xmlns:w16cei="http://schemas.microsoft.com/office/word/2026/wordml/cei" xmlns:w16cex="http://schemas.microsoft.com/office/word/2018/wordml/cex" xmlns:w16cid="http://schemas.microsoft.com/office/word/2016/wordml/cid" xmlns:w16="http://schemas.microsoft.com/office/word/2018/wordml" xmlns:w16sdtdh="http://schemas.microsoft.com/office/word/2020/wordml/sdtdatahash" xmlns:w16sdtfl="http://schemas.microsoft.com/office/word/2024/wordml/sdtformatlock" xmlns:w16se="http://schemas.microsoft.com/office/word/2015/wordml/symex" xmlns:w16du="http://schemas.microsoft.com/office/word/2023/wordml/word16du" xmlns:wne="http://schemas.microsoft.com/office/word/2006/wordml" mc:Ignorable="w14 w15 w16se w16cid w16 w16cex w16sdtdh w16sdtfl w16du wp14">
   <w:body>
     <w:p>
       <w:pPr>
@@ -96,6 +96,871 @@
     </w:p>
     <w:p>
       <w:pPr>
+        <w:numPr>
+          <w:ilvl w:val="0"/>
+          <w:numId w:val="1"/>
+        </w:numPr>
+        <w:spacing w:after="0" w:line="240" w:lineRule="auto"/>
+        <w:rPr>
+          <w:rFonts w:ascii="Arial" w:eastAsia="Times New Roman" w:hAnsi="Arial" w:cs="Arial"/>
+          <w:color w:val="000000" w:themeColor="text1"/>
+          <w:kern w:val="0"/>
+          <w:sz w:val="20"/>
+          <w:szCs w:val="20"/>
+          <w:highlight w:val="yellow"/>
+          <w:lang w:eastAsia="en-GB"/>
+          <w14:ligatures w14:val="none"/>
+        </w:rPr>
+      </w:pPr>
+      <w:proofErr w:type="spellStart"/>
+      <w:r>
+        <w:rPr>
+          <w:rFonts w:ascii="Arial" w:eastAsia="Times New Roman" w:hAnsi="Arial" w:cs="Arial"/>
+          <w:color w:val="000000" w:themeColor="text1"/>
+          <w:kern w:val="0"/>
+          <w:sz w:val="20"/>
+          <w:szCs w:val="20"/>
+          <w:highlight w:val="yellow"/>
+          <w:bdr w:val="none" w:sz="0" w:space="0" w:color="auto" w:frame="1"/>
+          <w:lang w:eastAsia="en-GB"/>
+          <w14:ligatures w14:val="none"/>
+        </w:rPr>
+        <w:t>Ghaffarian</w:t>
+      </w:r>
+      <w:proofErr w:type="spellEnd"/>
+      <w:r>
+        <w:rPr>
+          <w:rFonts w:ascii="Arial" w:eastAsia="Times New Roman" w:hAnsi="Arial" w:cs="Arial"/>
+          <w:color w:val="000000" w:themeColor="text1"/>
+          <w:kern w:val="0"/>
+          <w:sz w:val="20"/>
+          <w:szCs w:val="20"/>
+          <w:highlight w:val="yellow"/>
+          <w:bdr w:val="none" w:sz="0" w:space="0" w:color="auto" w:frame="1"/>
+          <w:lang w:eastAsia="en-GB"/>
+          <w14:ligatures w14:val="none"/>
+        </w:rPr>
+        <w:t>, S., Roy, D., Filatova, T. &amp; Kerle, N. (2021) Agent-based modelling of post-disaster recovery with remote sensing data. Computers, Environment and Urban Systems, 60, 15 p.</w:t>
+      </w:r>
+    </w:p>
+    <w:p>
+      <w:pPr>
+        <w:numPr>
+          <w:ilvl w:val="0"/>
+          <w:numId w:val="1"/>
+        </w:numPr>
+        <w:spacing w:after="0" w:line="240" w:lineRule="auto"/>
+        <w:rPr>
+          <w:rFonts w:ascii="Arial" w:eastAsia="Times New Roman" w:hAnsi="Arial" w:cs="Arial"/>
+          <w:color w:val="000000" w:themeColor="text1"/>
+          <w:kern w:val="0"/>
+          <w:sz w:val="20"/>
+          <w:szCs w:val="20"/>
+          <w:highlight w:val="yellow"/>
+          <w:lang w:eastAsia="en-GB"/>
+          <w14:ligatures w14:val="none"/>
+        </w:rPr>
+      </w:pPr>
+      <w:proofErr w:type="spellStart"/>
+      <w:r>
+        <w:rPr>
+          <w:rFonts w:ascii="Arial" w:eastAsia="Times New Roman" w:hAnsi="Arial" w:cs="Arial"/>
+          <w:color w:val="000000" w:themeColor="text1"/>
+          <w:kern w:val="0"/>
+          <w:sz w:val="20"/>
+          <w:szCs w:val="20"/>
+          <w:highlight w:val="yellow"/>
+          <w:bdr w:val="none" w:sz="0" w:space="0" w:color="auto" w:frame="1"/>
+          <w:lang w:eastAsia="en-GB"/>
+          <w14:ligatures w14:val="none"/>
+        </w:rPr>
+        <w:t>Ghaffarian</w:t>
+      </w:r>
+      <w:proofErr w:type="spellEnd"/>
+      <w:r>
+        <w:rPr>
+          <w:rFonts w:ascii="Arial" w:eastAsia="Times New Roman" w:hAnsi="Arial" w:cs="Arial"/>
+          <w:color w:val="000000" w:themeColor="text1"/>
+          <w:kern w:val="0"/>
+          <w:sz w:val="20"/>
+          <w:szCs w:val="20"/>
+          <w:highlight w:val="yellow"/>
+          <w:bdr w:val="none" w:sz="0" w:space="0" w:color="auto" w:frame="1"/>
+          <w:lang w:eastAsia="en-GB"/>
+          <w14:ligatures w14:val="none"/>
+        </w:rPr>
+        <w:t xml:space="preserve">, S., </w:t>
+      </w:r>
+      <w:proofErr w:type="spellStart"/>
+      <w:r>
+        <w:rPr>
+          <w:rFonts w:ascii="Arial" w:eastAsia="Times New Roman" w:hAnsi="Arial" w:cs="Arial"/>
+          <w:color w:val="000000" w:themeColor="text1"/>
+          <w:kern w:val="0"/>
+          <w:sz w:val="20"/>
+          <w:szCs w:val="20"/>
+          <w:highlight w:val="yellow"/>
+          <w:bdr w:val="none" w:sz="0" w:space="0" w:color="auto" w:frame="1"/>
+          <w:lang w:eastAsia="en-GB"/>
+          <w14:ligatures w14:val="none"/>
+        </w:rPr>
+        <w:t>Farhadabad</w:t>
+      </w:r>
+      <w:proofErr w:type="spellEnd"/>
+      <w:r>
+        <w:rPr>
+          <w:rFonts w:ascii="Arial" w:eastAsia="Times New Roman" w:hAnsi="Arial" w:cs="Arial"/>
+          <w:color w:val="000000" w:themeColor="text1"/>
+          <w:kern w:val="0"/>
+          <w:sz w:val="20"/>
+          <w:szCs w:val="20"/>
+          <w:highlight w:val="yellow"/>
+          <w:bdr w:val="none" w:sz="0" w:space="0" w:color="auto" w:frame="1"/>
+          <w:lang w:eastAsia="en-GB"/>
+          <w14:ligatures w14:val="none"/>
+        </w:rPr>
+        <w:t>, A.R. &amp; Kerle, N. (2020) Post-disaster recovery monitoring with Google Earth Engine. International Journal of Geo-Information, 10(13), 4574.</w:t>
+      </w:r>
+    </w:p>
+    <w:p>
+      <w:pPr>
+        <w:numPr>
+          <w:ilvl w:val="0"/>
+          <w:numId w:val="1"/>
+        </w:numPr>
+        <w:spacing w:after="0" w:line="240" w:lineRule="auto"/>
+        <w:rPr>
+          <w:rFonts w:ascii="Arial" w:eastAsia="Times New Roman" w:hAnsi="Arial" w:cs="Arial"/>
+          <w:color w:val="000000" w:themeColor="text1"/>
+          <w:kern w:val="0"/>
+          <w:sz w:val="20"/>
+          <w:szCs w:val="20"/>
+          <w:highlight w:val="yellow"/>
+          <w:lang w:eastAsia="en-GB"/>
+          <w14:ligatures w14:val="none"/>
+        </w:rPr>
+      </w:pPr>
+      <w:proofErr w:type="spellStart"/>
+      <w:r>
+        <w:rPr>
+          <w:rFonts w:ascii="Arial" w:eastAsia="Times New Roman" w:hAnsi="Arial" w:cs="Arial"/>
+          <w:color w:val="000000" w:themeColor="text1"/>
+          <w:kern w:val="0"/>
+          <w:sz w:val="20"/>
+          <w:szCs w:val="20"/>
+          <w:highlight w:val="yellow"/>
+          <w:bdr w:val="none" w:sz="0" w:space="0" w:color="auto" w:frame="1"/>
+          <w:lang w:eastAsia="en-GB"/>
+          <w14:ligatures w14:val="none"/>
+        </w:rPr>
+        <w:t>Ghaffarian</w:t>
+      </w:r>
+      <w:proofErr w:type="spellEnd"/>
+      <w:r>
+        <w:rPr>
+          <w:rFonts w:ascii="Arial" w:eastAsia="Times New Roman" w:hAnsi="Arial" w:cs="Arial"/>
+          <w:color w:val="000000" w:themeColor="text1"/>
+          <w:kern w:val="0"/>
+          <w:sz w:val="20"/>
+          <w:szCs w:val="20"/>
+          <w:highlight w:val="yellow"/>
+          <w:bdr w:val="none" w:sz="0" w:space="0" w:color="auto" w:frame="1"/>
+          <w:lang w:eastAsia="en-GB"/>
+          <w14:ligatures w14:val="none"/>
+        </w:rPr>
+        <w:t xml:space="preserve">, S., Kerle, N., </w:t>
+      </w:r>
+      <w:proofErr w:type="spellStart"/>
+      <w:r>
+        <w:rPr>
+          <w:rFonts w:ascii="Arial" w:eastAsia="Times New Roman" w:hAnsi="Arial" w:cs="Arial"/>
+          <w:color w:val="000000" w:themeColor="text1"/>
+          <w:kern w:val="0"/>
+          <w:sz w:val="20"/>
+          <w:szCs w:val="20"/>
+          <w:highlight w:val="yellow"/>
+          <w:bdr w:val="none" w:sz="0" w:space="0" w:color="auto" w:frame="1"/>
+          <w:lang w:eastAsia="en-GB"/>
+          <w14:ligatures w14:val="none"/>
+        </w:rPr>
+        <w:t>Pasolli</w:t>
+      </w:r>
+      <w:proofErr w:type="spellEnd"/>
+      <w:r>
+        <w:rPr>
+          <w:rFonts w:ascii="Arial" w:eastAsia="Times New Roman" w:hAnsi="Arial" w:cs="Arial"/>
+          <w:color w:val="000000" w:themeColor="text1"/>
+          <w:kern w:val="0"/>
+          <w:sz w:val="20"/>
+          <w:szCs w:val="20"/>
+          <w:highlight w:val="yellow"/>
+          <w:bdr w:val="none" w:sz="0" w:space="0" w:color="auto" w:frame="1"/>
+          <w:lang w:eastAsia="en-GB"/>
+          <w14:ligatures w14:val="none"/>
+        </w:rPr>
+        <w:t xml:space="preserve">, E. &amp; Jokar Arsanjani, J. (2019) Post-disaster building database updating using automated deep learning with pre-disaster </w:t>
+      </w:r>
+      <w:proofErr w:type="spellStart"/>
+      <w:r>
+        <w:rPr>
+          <w:rFonts w:ascii="Arial" w:eastAsia="Times New Roman" w:hAnsi="Arial" w:cs="Arial"/>
+          <w:color w:val="000000" w:themeColor="text1"/>
+          <w:kern w:val="0"/>
+          <w:sz w:val="20"/>
+          <w:szCs w:val="20"/>
+          <w:highlight w:val="yellow"/>
+          <w:bdr w:val="none" w:sz="0" w:space="0" w:color="auto" w:frame="1"/>
+          <w:lang w:eastAsia="en-GB"/>
+          <w14:ligatures w14:val="none"/>
+        </w:rPr>
+        <w:t>Openstreetmap</w:t>
+      </w:r>
+      <w:proofErr w:type="spellEnd"/>
+      <w:r>
+        <w:rPr>
+          <w:rFonts w:ascii="Arial" w:eastAsia="Times New Roman" w:hAnsi="Arial" w:cs="Arial"/>
+          <w:color w:val="000000" w:themeColor="text1"/>
+          <w:kern w:val="0"/>
+          <w:sz w:val="20"/>
+          <w:szCs w:val="20"/>
+          <w:highlight w:val="yellow"/>
+          <w:bdr w:val="none" w:sz="0" w:space="0" w:color="auto" w:frame="1"/>
+          <w:lang w:eastAsia="en-GB"/>
+          <w14:ligatures w14:val="none"/>
+        </w:rPr>
+        <w:t xml:space="preserve"> and multi-temporal satellite data. Remote Sensing, 11(20), 2427.</w:t>
+      </w:r>
+    </w:p>
+    <w:p>
+      <w:pPr>
+        <w:numPr>
+          <w:ilvl w:val="0"/>
+          <w:numId w:val="1"/>
+        </w:numPr>
+        <w:spacing w:after="0" w:line="240" w:lineRule="auto"/>
+        <w:rPr>
+          <w:rFonts w:ascii="Arial" w:eastAsia="Times New Roman" w:hAnsi="Arial" w:cs="Arial"/>
+          <w:color w:val="000000" w:themeColor="text1"/>
+          <w:kern w:val="0"/>
+          <w:sz w:val="20"/>
+          <w:szCs w:val="20"/>
+          <w:highlight w:val="yellow"/>
+          <w:lang w:eastAsia="en-GB"/>
+          <w14:ligatures w14:val="none"/>
+        </w:rPr>
+      </w:pPr>
+      <w:proofErr w:type="spellStart"/>
+      <w:r>
+        <w:rPr>
+          <w:rFonts w:ascii="Arial" w:eastAsia="Times New Roman" w:hAnsi="Arial" w:cs="Arial"/>
+          <w:color w:val="000000" w:themeColor="text1"/>
+          <w:kern w:val="0"/>
+          <w:sz w:val="20"/>
+          <w:szCs w:val="20"/>
+          <w:highlight w:val="yellow"/>
+          <w:bdr w:val="none" w:sz="0" w:space="0" w:color="auto" w:frame="1"/>
+          <w:lang w:eastAsia="en-GB"/>
+          <w14:ligatures w14:val="none"/>
+        </w:rPr>
+        <w:t>Ghaffarian</w:t>
+      </w:r>
+      <w:proofErr w:type="spellEnd"/>
+      <w:r>
+        <w:rPr>
+          <w:rFonts w:ascii="Arial" w:eastAsia="Times New Roman" w:hAnsi="Arial" w:cs="Arial"/>
+          <w:color w:val="000000" w:themeColor="text1"/>
+          <w:kern w:val="0"/>
+          <w:sz w:val="20"/>
+          <w:szCs w:val="20"/>
+          <w:highlight w:val="yellow"/>
+          <w:bdr w:val="none" w:sz="0" w:space="0" w:color="auto" w:frame="1"/>
+          <w:lang w:eastAsia="en-GB"/>
+          <w14:ligatures w14:val="none"/>
+        </w:rPr>
+        <w:t>, S. &amp; Kerle, N. (2019) Towards post-disaster debris identification for precise damage and recovery assessments from UAV and satellite images. ISPRS Archives of the Photogrammetry, Remote Sensing and Spatial Information Sciences, 42(2/W13), 7 p.</w:t>
+      </w:r>
+    </w:p>
+    <w:p>
+      <w:pPr>
+        <w:numPr>
+          <w:ilvl w:val="0"/>
+          <w:numId w:val="1"/>
+        </w:numPr>
+        <w:spacing w:after="0" w:line="240" w:lineRule="auto"/>
+        <w:rPr>
+          <w:rFonts w:ascii="Arial" w:eastAsia="Times New Roman" w:hAnsi="Arial" w:cs="Arial"/>
+          <w:color w:val="000000" w:themeColor="text1"/>
+          <w:kern w:val="0"/>
+          <w:sz w:val="20"/>
+          <w:szCs w:val="20"/>
+          <w:lang w:eastAsia="en-GB"/>
+          <w14:ligatures w14:val="none"/>
+        </w:rPr>
+      </w:pPr>
+      <w:r>
+        <w:rPr>
+          <w:rFonts w:ascii="Arial" w:hAnsi="Arial" w:cs="Arial"/>
+          <w:color w:val="000000"/>
+          <w:sz w:val="20"/>
+          <w:szCs w:val="20"/>
+        </w:rPr>
+        <w:t>Validating Nighttime Light Satellite Data as a Proxy: Quantifying Tropical Cyclone Impacts and Recovery in the Philippines</w:t>
+      </w:r>
+      <w:r>
+        <w:rPr>
+          <w:rFonts w:ascii="Arial" w:hAnsi="Arial" w:cs="Arial"/>
+          <w:color w:val="000000"/>
+          <w:sz w:val="20"/>
+          <w:szCs w:val="20"/>
+        </w:rPr>
+        <w:t xml:space="preserve"> by Elena Morais</w:t>
+      </w:r>
+    </w:p>
+    <w:p>
+      <w:pPr>
+        <w:spacing w:after="0" w:line="240" w:lineRule="auto"/>
+        <w:ind w:left="1440"/>
+        <w:rPr>
+          <w:rFonts w:ascii="Arial" w:hAnsi="Arial" w:cs="Arial"/>
+          <w:color w:val="000000"/>
+          <w:sz w:val="20"/>
+          <w:szCs w:val="20"/>
+        </w:rPr>
+      </w:pPr>
+    </w:p>
+    <w:p>
+      <w:pPr>
+        <w:spacing w:after="0" w:line="240" w:lineRule="auto"/>
+        <w:ind w:left="1440"/>
+        <w:rPr>
+          <w:rFonts w:ascii="Arial" w:eastAsia="Times New Roman" w:hAnsi="Arial" w:cs="Arial"/>
+          <w:color w:val="000000" w:themeColor="text1"/>
+          <w:kern w:val="0"/>
+          <w:sz w:val="20"/>
+          <w:szCs w:val="20"/>
+          <w:highlight w:val="yellow"/>
+          <w:lang w:eastAsia="en-GB"/>
+          <w14:ligatures w14:val="none"/>
+        </w:rPr>
+      </w:pPr>
+      <w:r>
+        <w:rPr>
+          <w:rFonts w:ascii="Arial" w:hAnsi="Arial" w:cs="Arial"/>
+          <w:color w:val="000000"/>
+          <w:sz w:val="20"/>
+          <w:szCs w:val="20"/>
+        </w:rPr>
+        <w:t>Abstract</w:t>
+      </w:r>
+      <w:r>
+        <w:rPr>
+          <w:rFonts w:ascii="Arial" w:eastAsia="Times New Roman" w:hAnsi="Arial" w:cs="Arial"/>
+          <w:color w:val="000000" w:themeColor="text1"/>
+          <w:kern w:val="0"/>
+          <w:sz w:val="20"/>
+          <w:szCs w:val="20"/>
+          <w:lang w:eastAsia="en-GB"/>
+          <w14:ligatures w14:val="none"/>
+        </w:rPr>
+        <w:t xml:space="preserve">: </w:t>
+      </w:r>
+      <w:r>
+        <w:rPr>
+          <w:rFonts w:ascii="Arial" w:hAnsi="Arial" w:cs="Arial"/>
+          <w:color w:val="000000"/>
+          <w:sz w:val="20"/>
+          <w:szCs w:val="20"/>
+        </w:rPr>
+        <w:t>As the number of populations exposed to and impacted by tropical cyclones continues to</w:t>
+      </w:r>
+      <w:r>
+        <w:rPr>
+          <w:rFonts w:ascii="Arial" w:hAnsi="Arial" w:cs="Arial"/>
+          <w:color w:val="000000"/>
+          <w:sz w:val="20"/>
+          <w:szCs w:val="20"/>
+        </w:rPr>
+        <w:t xml:space="preserve"> </w:t>
+      </w:r>
+      <w:r>
+        <w:rPr>
+          <w:rFonts w:ascii="Arial" w:hAnsi="Arial" w:cs="Arial"/>
+          <w:color w:val="000000"/>
+          <w:sz w:val="20"/>
+          <w:szCs w:val="20"/>
+        </w:rPr>
+        <w:t>grow annually, the need to quickly quantify and monitor impact and recovery has likewise</w:t>
+      </w:r>
+      <w:r>
+        <w:rPr>
+          <w:rFonts w:ascii="Arial" w:hAnsi="Arial" w:cs="Arial"/>
+          <w:color w:val="000000"/>
+          <w:sz w:val="20"/>
+          <w:szCs w:val="20"/>
+        </w:rPr>
+        <w:t xml:space="preserve"> </w:t>
+      </w:r>
+      <w:r>
+        <w:rPr>
+          <w:rFonts w:ascii="Arial" w:hAnsi="Arial" w:cs="Arial"/>
+          <w:color w:val="000000"/>
+          <w:sz w:val="20"/>
+          <w:szCs w:val="20"/>
+        </w:rPr>
+        <w:t>increased. Both have historically proven difficult, with data collection lagging days or</w:t>
+      </w:r>
+      <w:r>
+        <w:rPr>
+          <w:rFonts w:ascii="Arial" w:hAnsi="Arial" w:cs="Arial"/>
+          <w:color w:val="000000"/>
+          <w:sz w:val="20"/>
+          <w:szCs w:val="20"/>
+        </w:rPr>
+        <w:t xml:space="preserve"> </w:t>
+      </w:r>
+      <w:r>
+        <w:rPr>
+          <w:rFonts w:ascii="Arial" w:hAnsi="Arial" w:cs="Arial"/>
+          <w:color w:val="000000"/>
+          <w:sz w:val="20"/>
+          <w:szCs w:val="20"/>
+        </w:rPr>
+        <w:t>months behind the event, hindering timely resource allocation. Many studies have explored</w:t>
+      </w:r>
+      <w:r>
+        <w:rPr>
+          <w:rFonts w:ascii="Arial" w:hAnsi="Arial" w:cs="Arial"/>
+          <w:color w:val="000000"/>
+          <w:sz w:val="20"/>
+          <w:szCs w:val="20"/>
+        </w:rPr>
+        <w:t xml:space="preserve"> </w:t>
+      </w:r>
+      <w:r>
+        <w:rPr>
+          <w:rFonts w:ascii="Arial" w:hAnsi="Arial" w:cs="Arial"/>
+          <w:color w:val="000000"/>
+          <w:sz w:val="20"/>
+          <w:szCs w:val="20"/>
+        </w:rPr>
+        <w:t>the use of nighttime lights post-disaster, but validation against independent ground-truth</w:t>
+      </w:r>
+      <w:r>
+        <w:rPr>
+          <w:rFonts w:ascii="Arial" w:hAnsi="Arial" w:cs="Arial"/>
+          <w:color w:val="000000"/>
+          <w:sz w:val="20"/>
+          <w:szCs w:val="20"/>
+        </w:rPr>
+        <w:t xml:space="preserve"> </w:t>
+      </w:r>
+      <w:r>
+        <w:rPr>
+          <w:rFonts w:ascii="Arial" w:hAnsi="Arial" w:cs="Arial"/>
+          <w:color w:val="000000"/>
+          <w:sz w:val="20"/>
+          <w:szCs w:val="20"/>
+        </w:rPr>
+        <w:t>impact data remains limited. Further, studies have noted a discrepancy in recovery between</w:t>
+      </w:r>
+      <w:r>
+        <w:rPr>
+          <w:rFonts w:ascii="Arial" w:hAnsi="Arial" w:cs="Arial"/>
+          <w:color w:val="000000"/>
+          <w:sz w:val="20"/>
+          <w:szCs w:val="20"/>
+        </w:rPr>
+        <w:t xml:space="preserve"> </w:t>
+      </w:r>
+      <w:r>
+        <w:rPr>
+          <w:rFonts w:ascii="Arial" w:hAnsi="Arial" w:cs="Arial"/>
+          <w:color w:val="000000"/>
+          <w:sz w:val="20"/>
+          <w:szCs w:val="20"/>
+        </w:rPr>
+        <w:t>underprivileged communities and areas where nighttime light can further obscure them,</w:t>
+      </w:r>
+      <w:r>
+        <w:rPr>
+          <w:rFonts w:ascii="Arial" w:hAnsi="Arial" w:cs="Arial"/>
+          <w:color w:val="000000"/>
+          <w:sz w:val="20"/>
+          <w:szCs w:val="20"/>
+        </w:rPr>
+        <w:t xml:space="preserve"> </w:t>
+      </w:r>
+      <w:r>
+        <w:rPr>
+          <w:rFonts w:ascii="Arial" w:hAnsi="Arial" w:cs="Arial"/>
+          <w:color w:val="000000"/>
+          <w:sz w:val="20"/>
+          <w:szCs w:val="20"/>
+        </w:rPr>
+        <w:t xml:space="preserve">raising questions about equity and justice. This study aims to verify the use of </w:t>
+      </w:r>
+      <w:proofErr w:type="spellStart"/>
+      <w:r>
+        <w:rPr>
+          <w:rFonts w:ascii="Arial" w:hAnsi="Arial" w:cs="Arial"/>
+          <w:color w:val="000000"/>
+          <w:sz w:val="20"/>
+          <w:szCs w:val="20"/>
+        </w:rPr>
+        <w:t>preprocessed</w:t>
+      </w:r>
+      <w:proofErr w:type="spellEnd"/>
+      <w:r>
+        <w:rPr>
+          <w:rFonts w:ascii="Arial" w:hAnsi="Arial" w:cs="Arial"/>
+          <w:color w:val="000000"/>
+          <w:sz w:val="20"/>
+          <w:szCs w:val="20"/>
+        </w:rPr>
+        <w:t xml:space="preserve"> </w:t>
+      </w:r>
+      <w:r>
+        <w:rPr>
+          <w:rFonts w:ascii="Arial" w:hAnsi="Arial" w:cs="Arial"/>
+          <w:color w:val="000000"/>
+          <w:sz w:val="20"/>
+          <w:szCs w:val="20"/>
+        </w:rPr>
+        <w:t>nighttime light as a proxy for the magnitude and location of impact and recovery time.</w:t>
+      </w:r>
+      <w:r>
+        <w:rPr>
+          <w:rFonts w:ascii="Arial" w:hAnsi="Arial" w:cs="Arial"/>
+          <w:color w:val="000000"/>
+          <w:sz w:val="20"/>
+          <w:szCs w:val="20"/>
+        </w:rPr>
+        <w:t xml:space="preserve"> </w:t>
+      </w:r>
+      <w:r>
+        <w:rPr>
+          <w:rFonts w:ascii="Arial" w:hAnsi="Arial" w:cs="Arial"/>
+          <w:color w:val="000000"/>
+          <w:sz w:val="20"/>
+          <w:szCs w:val="20"/>
+        </w:rPr>
+        <w:t xml:space="preserve">Using predictive </w:t>
+      </w:r>
+      <w:proofErr w:type="spellStart"/>
+      <w:r>
+        <w:rPr>
+          <w:rFonts w:ascii="Arial" w:hAnsi="Arial" w:cs="Arial"/>
+          <w:color w:val="000000"/>
+          <w:sz w:val="20"/>
+          <w:szCs w:val="20"/>
+        </w:rPr>
+        <w:t>modeling</w:t>
+      </w:r>
+      <w:proofErr w:type="spellEnd"/>
+      <w:r>
+        <w:rPr>
+          <w:rFonts w:ascii="Arial" w:hAnsi="Arial" w:cs="Arial"/>
+          <w:color w:val="000000"/>
+          <w:sz w:val="20"/>
+          <w:szCs w:val="20"/>
+        </w:rPr>
+        <w:t xml:space="preserve"> and correlation and residual analyses, this study will verify the</w:t>
+      </w:r>
+      <w:r>
+        <w:rPr>
+          <w:rFonts w:ascii="Arial" w:hAnsi="Arial" w:cs="Arial"/>
+          <w:color w:val="000000"/>
+          <w:sz w:val="20"/>
+          <w:szCs w:val="20"/>
+        </w:rPr>
+        <w:t xml:space="preserve"> </w:t>
+      </w:r>
+      <w:r>
+        <w:rPr>
+          <w:rFonts w:ascii="Arial" w:hAnsi="Arial" w:cs="Arial"/>
+          <w:color w:val="000000"/>
+          <w:sz w:val="20"/>
+          <w:szCs w:val="20"/>
+        </w:rPr>
+        <w:t>predictive utility of NTL-based metrics and their social vulnerability implications. Insights</w:t>
+      </w:r>
+      <w:r>
+        <w:rPr>
+          <w:rFonts w:ascii="Arial" w:hAnsi="Arial" w:cs="Arial"/>
+          <w:color w:val="000000"/>
+          <w:sz w:val="20"/>
+          <w:szCs w:val="20"/>
+        </w:rPr>
+        <w:t xml:space="preserve"> </w:t>
+      </w:r>
+      <w:r>
+        <w:rPr>
+          <w:rFonts w:ascii="Arial" w:hAnsi="Arial" w:cs="Arial"/>
+          <w:color w:val="000000"/>
+          <w:sz w:val="20"/>
+          <w:szCs w:val="20"/>
+        </w:rPr>
+        <w:t>from this research can be extended globally, where ground-truth data is not readily</w:t>
+      </w:r>
+      <w:r>
+        <w:rPr>
+          <w:rFonts w:ascii="Arial" w:hAnsi="Arial" w:cs="Arial"/>
+          <w:color w:val="000000"/>
+          <w:sz w:val="20"/>
+          <w:szCs w:val="20"/>
+        </w:rPr>
+        <w:t xml:space="preserve"> </w:t>
+      </w:r>
+      <w:r>
+        <w:rPr>
+          <w:rFonts w:ascii="Arial" w:hAnsi="Arial" w:cs="Arial"/>
+          <w:color w:val="000000"/>
+          <w:sz w:val="20"/>
+          <w:szCs w:val="20"/>
+        </w:rPr>
+        <w:t>available, and provide insights into affected communities.</w:t>
+      </w:r>
+    </w:p>
+    <w:p>
+      <w:pPr>
+        <w:spacing w:after="0" w:line="240" w:lineRule="auto"/>
+        <w:rPr>
+          <w:rFonts w:ascii="Arial" w:hAnsi="Arial" w:cs="Arial"/>
+          <w:color w:val="000000"/>
+          <w:sz w:val="20"/>
+          <w:szCs w:val="20"/>
+        </w:rPr>
+      </w:pPr>
+    </w:p>
+    <w:p>
+      <w:pPr>
+        <w:spacing w:after="0" w:line="240" w:lineRule="auto"/>
+        <w:ind w:left="720"/>
+        <w:rPr>
+          <w:rFonts w:ascii="Arial" w:hAnsi="Arial" w:cs="Arial"/>
+          <w:color w:val="000000"/>
+          <w:sz w:val="20"/>
+          <w:szCs w:val="20"/>
+        </w:rPr>
+      </w:pPr>
+      <w:r>
+        <w:rPr>
+          <w:rFonts w:ascii="Arial" w:hAnsi="Arial" w:cs="Arial"/>
+          <w:color w:val="000000"/>
+          <w:sz w:val="20"/>
+          <w:szCs w:val="20"/>
+        </w:rPr>
+        <w:t>The study aims application right away, meanwhile we inspect diagnostics of usability first,</w:t>
+      </w:r>
+      <w:r>
+        <w:rPr>
+          <w:rFonts w:ascii="Arial" w:hAnsi="Arial" w:cs="Arial"/>
+          <w:color w:val="000000"/>
+          <w:sz w:val="20"/>
+          <w:szCs w:val="20"/>
+        </w:rPr>
+        <w:t xml:space="preserve"> then proceed to apply diagnostic o</w:t>
+      </w:r>
+      <w:r>
+        <w:rPr>
+          <w:rFonts w:ascii="Arial" w:hAnsi="Arial" w:cs="Arial"/>
+          <w:color w:val="000000"/>
+          <w:sz w:val="20"/>
+          <w:szCs w:val="20"/>
+        </w:rPr>
+        <w:t>bs</w:t>
+      </w:r>
+      <w:r>
+        <w:rPr>
+          <w:rFonts w:ascii="Arial" w:hAnsi="Arial" w:cs="Arial"/>
+          <w:color w:val="000000"/>
+          <w:sz w:val="20"/>
+          <w:szCs w:val="20"/>
+        </w:rPr>
+        <w:t>er</w:t>
+      </w:r>
+      <w:r>
+        <w:rPr>
+          <w:rFonts w:ascii="Arial" w:hAnsi="Arial" w:cs="Arial"/>
+          <w:color w:val="000000"/>
+          <w:sz w:val="20"/>
+          <w:szCs w:val="20"/>
+        </w:rPr>
+        <w:t>v</w:t>
+      </w:r>
+      <w:r>
+        <w:rPr>
+          <w:rFonts w:ascii="Arial" w:hAnsi="Arial" w:cs="Arial"/>
+          <w:color w:val="000000"/>
+          <w:sz w:val="20"/>
+          <w:szCs w:val="20"/>
+        </w:rPr>
+        <w:t>a</w:t>
+      </w:r>
+      <w:r>
+        <w:rPr>
+          <w:rFonts w:ascii="Arial" w:hAnsi="Arial" w:cs="Arial"/>
+          <w:color w:val="000000"/>
+          <w:sz w:val="20"/>
+          <w:szCs w:val="20"/>
+        </w:rPr>
+        <w:t>b</w:t>
+      </w:r>
+      <w:r>
+        <w:rPr>
+          <w:rFonts w:ascii="Arial" w:hAnsi="Arial" w:cs="Arial"/>
+          <w:color w:val="000000"/>
+          <w:sz w:val="20"/>
+          <w:szCs w:val="20"/>
+        </w:rPr>
+        <w:t xml:space="preserve">ility on disaster phases. Disaster modelling requires baseline comparison, but we confront the reliability of these phases to begin with. We note patterns of </w:t>
+      </w:r>
+      <w:r>
+        <w:rPr>
+          <w:rFonts w:ascii="Arial" w:hAnsi="Arial" w:cs="Arial"/>
+          <w:color w:val="000000"/>
+          <w:sz w:val="20"/>
+          <w:szCs w:val="20"/>
+        </w:rPr>
+        <w:t>alignment and</w:t>
+      </w:r>
+      <w:r>
+        <w:rPr>
+          <w:rFonts w:ascii="Arial" w:hAnsi="Arial" w:cs="Arial"/>
+          <w:color w:val="000000"/>
+          <w:sz w:val="20"/>
+          <w:szCs w:val="20"/>
+        </w:rPr>
+        <w:t xml:space="preserve"> explain the divergence. </w:t>
+      </w:r>
+    </w:p>
+    <w:p>
+      <w:pPr>
+        <w:spacing w:after="0" w:line="240" w:lineRule="auto"/>
+        <w:ind w:left="720"/>
+        <w:rPr>
+          <w:rFonts w:ascii="Arial" w:hAnsi="Arial" w:cs="Arial"/>
+          <w:color w:val="000000"/>
+          <w:sz w:val="20"/>
+          <w:szCs w:val="20"/>
+        </w:rPr>
+      </w:pPr>
+    </w:p>
+    <w:p>
+      <w:pPr>
+        <w:spacing w:after="0" w:line="240" w:lineRule="auto"/>
+        <w:ind w:left="720"/>
+        <w:rPr>
+          <w:rFonts w:ascii="Arial" w:hAnsi="Arial" w:cs="Arial"/>
+          <w:color w:val="000000"/>
+          <w:sz w:val="20"/>
+          <w:szCs w:val="20"/>
+        </w:rPr>
+      </w:pPr>
+      <w:r>
+        <w:rPr>
+          <w:rFonts w:ascii="Arial" w:hAnsi="Arial" w:cs="Arial"/>
+          <w:color w:val="000000"/>
+          <w:sz w:val="20"/>
+          <w:szCs w:val="20"/>
+        </w:rPr>
+        <w:t>On the l</w:t>
+      </w:r>
+      <w:r>
+        <w:rPr>
+          <w:rFonts w:ascii="Arial" w:hAnsi="Arial" w:cs="Arial"/>
+          <w:color w:val="000000"/>
+          <w:sz w:val="20"/>
+          <w:szCs w:val="20"/>
+        </w:rPr>
+        <w:t xml:space="preserve">ens of equity and justice, </w:t>
+      </w:r>
+      <w:r>
+        <w:rPr>
+          <w:rFonts w:ascii="Arial" w:hAnsi="Arial" w:cs="Arial"/>
+          <w:color w:val="000000"/>
+          <w:sz w:val="20"/>
+          <w:szCs w:val="20"/>
+        </w:rPr>
+        <w:t xml:space="preserve">here we adapt </w:t>
+      </w:r>
+      <w:proofErr w:type="spellStart"/>
+      <w:r>
+        <w:rPr>
+          <w:rFonts w:ascii="Arial" w:hAnsi="Arial" w:cs="Arial"/>
+          <w:color w:val="000000"/>
+          <w:sz w:val="20"/>
+          <w:szCs w:val="20"/>
+        </w:rPr>
+        <w:t>Ghafarian’s</w:t>
+      </w:r>
+      <w:proofErr w:type="spellEnd"/>
+      <w:r>
+        <w:rPr>
+          <w:rFonts w:ascii="Arial" w:hAnsi="Arial" w:cs="Arial"/>
+          <w:color w:val="000000"/>
+          <w:sz w:val="20"/>
+          <w:szCs w:val="20"/>
+        </w:rPr>
+        <w:t xml:space="preserve"> </w:t>
+      </w:r>
+      <w:r>
+        <w:rPr>
+          <w:rFonts w:ascii="Arial" w:hAnsi="Arial" w:cs="Arial"/>
+          <w:color w:val="000000"/>
+          <w:sz w:val="20"/>
+          <w:szCs w:val="20"/>
+        </w:rPr>
+        <w:t>classification</w:t>
+      </w:r>
+      <w:r>
+        <w:rPr>
+          <w:rFonts w:ascii="Arial" w:hAnsi="Arial" w:cs="Arial"/>
+          <w:color w:val="000000"/>
+          <w:sz w:val="20"/>
+          <w:szCs w:val="20"/>
+        </w:rPr>
+        <w:t xml:space="preserve"> of NTL as a representation of functional recovery. It needs multi-source </w:t>
+      </w:r>
+      <w:r>
+        <w:rPr>
+          <w:rFonts w:ascii="Arial" w:hAnsi="Arial" w:cs="Arial"/>
+          <w:color w:val="000000"/>
+          <w:sz w:val="20"/>
+          <w:szCs w:val="20"/>
+        </w:rPr>
+        <w:t>perspective to be able to make claims even about resilience</w:t>
+      </w:r>
+      <w:r>
+        <w:rPr>
+          <w:rFonts w:ascii="Arial" w:hAnsi="Arial" w:cs="Arial"/>
+          <w:color w:val="000000"/>
+          <w:sz w:val="20"/>
+          <w:szCs w:val="20"/>
+        </w:rPr>
+        <w:t>. Claims about what can (and cannot be claimed) by nighttime lights must be made explicit.</w:t>
+      </w:r>
+      <w:r>
+        <w:rPr>
+          <w:rFonts w:ascii="Arial" w:hAnsi="Arial" w:cs="Arial"/>
+          <w:color w:val="000000"/>
+          <w:sz w:val="20"/>
+          <w:szCs w:val="20"/>
+        </w:rPr>
+        <w:t xml:space="preserve"> </w:t>
+      </w:r>
+    </w:p>
+    <w:p>
+      <w:pPr>
+        <w:spacing w:after="0" w:line="240" w:lineRule="auto"/>
+        <w:rPr>
+          <w:rFonts w:ascii="Arial" w:hAnsi="Arial" w:cs="Arial"/>
+          <w:color w:val="000000"/>
+        </w:rPr>
+      </w:pPr>
+    </w:p>
+    <w:p>
+      <w:pPr>
         <w:pStyle w:val="NormalWeb"/>
         <w:numPr>
           <w:ilvl w:val="0"/>
@@ -120,288 +985,707 @@
     </w:p>
     <w:p>
       <w:pPr>
+        <w:pStyle w:val="NormalWeb"/>
+        <w:spacing w:before="0" w:beforeAutospacing="0" w:after="0" w:afterAutospacing="0"/>
+        <w:ind w:left="1440"/>
+        <w:rPr>
+          <w:rFonts w:ascii="Arial" w:hAnsi="Arial" w:cs="Arial"/>
+          <w:color w:val="242424"/>
+          <w:sz w:val="20"/>
+          <w:szCs w:val="20"/>
+          <w:bdr w:val="none" w:sz="0" w:space="0" w:color="auto" w:frame="1"/>
+        </w:rPr>
+      </w:pPr>
+      <w:r>
+        <w:rPr>
+          <w:rFonts w:ascii="Arial" w:hAnsi="Arial" w:cs="Arial"/>
+          <w:color w:val="242424"/>
+          <w:sz w:val="20"/>
+          <w:szCs w:val="20"/>
+          <w:bdr w:val="none" w:sz="0" w:space="0" w:color="auto" w:frame="1"/>
+        </w:rPr>
+        <w:t xml:space="preserve">For our purposes it’s less relevant than I had thought. It still assumes linearity between pre-disaster and post-recovery light levels. Instead, it focuses on the continued use of DMSP data that have many limitations. The detailed comparison of DMSP and VIIRS in the damage/recovery context is insightful, though. I still think that the question of </w:t>
+      </w:r>
+      <w:r>
+        <w:rPr>
+          <w:rFonts w:ascii="Arial" w:hAnsi="Arial" w:cs="Arial"/>
+          <w:b/>
+          <w:bCs/>
+          <w:color w:val="242424"/>
+          <w:sz w:val="20"/>
+          <w:szCs w:val="20"/>
+          <w:highlight w:val="yellow"/>
+          <w:bdr w:val="none" w:sz="0" w:space="0" w:color="auto" w:frame="1"/>
+        </w:rPr>
+        <w:t>_</w:t>
+      </w:r>
+      <w:r>
+        <w:rPr>
+          <w:rFonts w:ascii="Arial" w:hAnsi="Arial" w:cs="Arial"/>
+          <w:b/>
+          <w:bCs/>
+          <w:i/>
+          <w:iCs/>
+          <w:color w:val="242424"/>
+          <w:sz w:val="20"/>
+          <w:szCs w:val="20"/>
+          <w:highlight w:val="yellow"/>
+          <w:bdr w:val="none" w:sz="0" w:space="0" w:color="auto" w:frame="1"/>
+        </w:rPr>
+        <w:t>how</w:t>
+      </w:r>
+      <w:r>
+        <w:rPr>
+          <w:rFonts w:ascii="Arial" w:hAnsi="Arial" w:cs="Arial"/>
+          <w:b/>
+          <w:bCs/>
+          <w:color w:val="242424"/>
+          <w:sz w:val="20"/>
+          <w:szCs w:val="20"/>
+          <w:highlight w:val="yellow"/>
+          <w:bdr w:val="none" w:sz="0" w:space="0" w:color="auto" w:frame="1"/>
+        </w:rPr>
+        <w:t>_ light emissions change during recovery as a function of changes in economic/industrial activity</w:t>
+      </w:r>
+      <w:r>
+        <w:rPr>
+          <w:rFonts w:ascii="Arial" w:hAnsi="Arial" w:cs="Arial"/>
+          <w:b/>
+          <w:bCs/>
+          <w:color w:val="242424"/>
+          <w:sz w:val="20"/>
+          <w:szCs w:val="20"/>
+          <w:bdr w:val="none" w:sz="0" w:space="0" w:color="auto" w:frame="1"/>
+        </w:rPr>
+        <w:t xml:space="preserve"> </w:t>
+      </w:r>
+      <w:r>
+        <w:rPr>
+          <w:rFonts w:ascii="Arial" w:hAnsi="Arial" w:cs="Arial"/>
+          <w:color w:val="242424"/>
+          <w:sz w:val="20"/>
+          <w:szCs w:val="20"/>
+          <w:bdr w:val="none" w:sz="0" w:space="0" w:color="auto" w:frame="1"/>
+        </w:rPr>
+        <w:t xml:space="preserve">(-&gt; Kobe, 1995), </w:t>
+      </w:r>
+      <w:r>
+        <w:rPr>
+          <w:rFonts w:ascii="Arial" w:hAnsi="Arial" w:cs="Arial"/>
+          <w:b/>
+          <w:bCs/>
+          <w:color w:val="242424"/>
+          <w:sz w:val="20"/>
+          <w:szCs w:val="20"/>
+          <w:bdr w:val="none" w:sz="0" w:space="0" w:color="auto" w:frame="1"/>
+        </w:rPr>
+        <w:t>leapfrogging</w:t>
+      </w:r>
+      <w:r>
+        <w:rPr>
+          <w:rFonts w:ascii="Arial" w:hAnsi="Arial" w:cs="Arial"/>
+          <w:color w:val="242424"/>
+          <w:sz w:val="20"/>
+          <w:szCs w:val="20"/>
+          <w:bdr w:val="none" w:sz="0" w:space="0" w:color="auto" w:frame="1"/>
+        </w:rPr>
+        <w:t xml:space="preserve"> (people </w:t>
+      </w:r>
+      <w:proofErr w:type="spellStart"/>
+      <w:r>
+        <w:rPr>
+          <w:rFonts w:ascii="Arial" w:hAnsi="Arial" w:cs="Arial"/>
+          <w:color w:val="242424"/>
+          <w:sz w:val="20"/>
+          <w:szCs w:val="20"/>
+          <w:bdr w:val="none" w:sz="0" w:space="0" w:color="auto" w:frame="1"/>
+        </w:rPr>
+        <w:t>en</w:t>
+      </w:r>
+      <w:proofErr w:type="spellEnd"/>
+      <w:r>
+        <w:rPr>
+          <w:rFonts w:ascii="Arial" w:hAnsi="Arial" w:cs="Arial"/>
+          <w:color w:val="242424"/>
+          <w:sz w:val="20"/>
+          <w:szCs w:val="20"/>
+          <w:bdr w:val="none" w:sz="0" w:space="0" w:color="auto" w:frame="1"/>
+        </w:rPr>
+        <w:t xml:space="preserve"> masse replacing old light types of low-emission LED, etc.) is one of the most interesting and relevant ones. It will all depend on how much ground information you can get, on electric grid data, NGO reports (donations of LED lamps after Haiyan, etc.), disaggregated GDP data, etc.</w:t>
+      </w:r>
+    </w:p>
+    <w:p>
+      <w:pPr>
+        <w:pStyle w:val="NormalWeb"/>
+        <w:spacing w:before="0" w:beforeAutospacing="0" w:after="0" w:afterAutospacing="0"/>
+        <w:ind w:left="1440"/>
+        <w:rPr>
+          <w:rFonts w:ascii="Arial" w:hAnsi="Arial" w:cs="Arial"/>
+          <w:color w:val="242424"/>
+          <w:sz w:val="20"/>
+          <w:szCs w:val="20"/>
+          <w:bdr w:val="none" w:sz="0" w:space="0" w:color="auto" w:frame="1"/>
+        </w:rPr>
+      </w:pPr>
+    </w:p>
+    <w:p>
+      <w:pPr>
+        <w:pStyle w:val="NormalWeb"/>
+        <w:spacing w:before="0" w:beforeAutospacing="0" w:after="0" w:afterAutospacing="0"/>
+        <w:ind w:left="1440"/>
+        <w:rPr>
+          <w:rFonts w:ascii="Arial" w:hAnsi="Arial" w:cs="Arial"/>
+          <w:b/>
+          <w:bCs/>
+          <w:color w:val="242424"/>
+          <w:sz w:val="20"/>
+          <w:szCs w:val="20"/>
+          <w:bdr w:val="none" w:sz="0" w:space="0" w:color="auto" w:frame="1"/>
+        </w:rPr>
+      </w:pPr>
+      <w:r>
+        <w:rPr>
+          <w:rFonts w:ascii="Arial" w:hAnsi="Arial" w:cs="Arial"/>
+          <w:b/>
+          <w:bCs/>
+          <w:color w:val="242424"/>
+          <w:sz w:val="20"/>
+          <w:szCs w:val="20"/>
+          <w:bdr w:val="none" w:sz="0" w:space="0" w:color="auto" w:frame="1"/>
+        </w:rPr>
+        <w:t>economic/industrial activity</w:t>
+      </w:r>
+      <w:r>
+        <w:rPr>
+          <w:rFonts w:ascii="Arial" w:hAnsi="Arial" w:cs="Arial"/>
+          <w:b/>
+          <w:bCs/>
+          <w:color w:val="242424"/>
+          <w:sz w:val="20"/>
+          <w:szCs w:val="20"/>
+          <w:bdr w:val="none" w:sz="0" w:space="0" w:color="auto" w:frame="1"/>
+        </w:rPr>
+        <w:t xml:space="preserve"> – through settlement stratification, and baseline modelling</w:t>
+      </w:r>
+    </w:p>
+    <w:p>
+      <w:pPr>
+        <w:pStyle w:val="NormalWeb"/>
+        <w:spacing w:before="0" w:beforeAutospacing="0" w:after="0" w:afterAutospacing="0"/>
+        <w:ind w:left="1440"/>
+        <w:rPr>
+          <w:rFonts w:ascii="Arial" w:hAnsi="Arial" w:cs="Arial"/>
+          <w:b/>
+          <w:bCs/>
+          <w:color w:val="242424"/>
+          <w:sz w:val="20"/>
+          <w:szCs w:val="20"/>
+          <w:bdr w:val="none" w:sz="0" w:space="0" w:color="auto" w:frame="1"/>
+        </w:rPr>
+      </w:pPr>
+      <w:r>
+        <w:rPr>
+          <w:rFonts w:ascii="Arial" w:hAnsi="Arial" w:cs="Arial"/>
+          <w:b/>
+          <w:bCs/>
+          <w:color w:val="242424"/>
+          <w:sz w:val="20"/>
+          <w:szCs w:val="20"/>
+          <w:bdr w:val="none" w:sz="0" w:space="0" w:color="auto" w:frame="1"/>
+        </w:rPr>
+        <w:lastRenderedPageBreak/>
+        <w:t xml:space="preserve">LED transition – can be noted, information must be gathered, but not </w:t>
+      </w:r>
+      <w:r>
+        <w:rPr>
+          <w:rFonts w:ascii="Arial" w:hAnsi="Arial" w:cs="Arial"/>
+          <w:b/>
+          <w:bCs/>
+          <w:color w:val="242424"/>
+          <w:sz w:val="20"/>
+          <w:szCs w:val="20"/>
+          <w:bdr w:val="none" w:sz="0" w:space="0" w:color="auto" w:frame="1"/>
+        </w:rPr>
+        <w:t xml:space="preserve">a priority </w:t>
+      </w:r>
+    </w:p>
+    <w:p>
+      <w:pPr>
+        <w:pStyle w:val="NormalWeb"/>
+        <w:spacing w:before="0" w:beforeAutospacing="0" w:after="0" w:afterAutospacing="0"/>
+        <w:ind w:left="1440"/>
+        <w:rPr>
+          <w:rFonts w:ascii="Arial" w:hAnsi="Arial" w:cs="Arial"/>
+          <w:b/>
+          <w:bCs/>
+          <w:color w:val="242424"/>
+          <w:sz w:val="20"/>
+          <w:szCs w:val="20"/>
+          <w:bdr w:val="none" w:sz="0" w:space="0" w:color="auto" w:frame="1"/>
+        </w:rPr>
+      </w:pPr>
+      <w:r>
+        <w:rPr>
+          <w:rFonts w:ascii="Arial" w:hAnsi="Arial" w:cs="Arial"/>
+          <w:b/>
+          <w:bCs/>
+          <w:color w:val="242424"/>
+          <w:sz w:val="20"/>
+          <w:szCs w:val="20"/>
+          <w:bdr w:val="none" w:sz="0" w:space="0" w:color="auto" w:frame="1"/>
+        </w:rPr>
+        <w:t xml:space="preserve">Electric grid data – present and accessible on a </w:t>
+      </w:r>
+      <w:proofErr w:type="spellStart"/>
+      <w:r>
+        <w:rPr>
+          <w:rFonts w:ascii="Arial" w:hAnsi="Arial" w:cs="Arial"/>
+          <w:b/>
+          <w:bCs/>
+          <w:color w:val="242424"/>
+          <w:sz w:val="20"/>
+          <w:szCs w:val="20"/>
+          <w:bdr w:val="none" w:sz="0" w:space="0" w:color="auto" w:frame="1"/>
+        </w:rPr>
+        <w:t>subgrid</w:t>
+      </w:r>
+      <w:proofErr w:type="spellEnd"/>
+      <w:r>
+        <w:rPr>
+          <w:rFonts w:ascii="Arial" w:hAnsi="Arial" w:cs="Arial"/>
+          <w:b/>
+          <w:bCs/>
+          <w:color w:val="242424"/>
+          <w:sz w:val="20"/>
+          <w:szCs w:val="20"/>
+          <w:bdr w:val="none" w:sz="0" w:space="0" w:color="auto" w:frame="1"/>
+        </w:rPr>
+        <w:t xml:space="preserve"> level</w:t>
+      </w:r>
+    </w:p>
+    <w:p>
+      <w:pPr>
+        <w:pStyle w:val="NormalWeb"/>
+        <w:spacing w:before="0" w:beforeAutospacing="0" w:after="0" w:afterAutospacing="0"/>
+        <w:ind w:left="1440"/>
+        <w:rPr>
+          <w:rFonts w:ascii="Arial" w:hAnsi="Arial" w:cs="Arial"/>
+          <w:b/>
+          <w:bCs/>
+          <w:color w:val="242424"/>
+          <w:sz w:val="20"/>
+          <w:szCs w:val="20"/>
+          <w:bdr w:val="none" w:sz="0" w:space="0" w:color="auto" w:frame="1"/>
+        </w:rPr>
+      </w:pPr>
+      <w:r>
+        <w:rPr>
+          <w:rFonts w:ascii="Arial" w:hAnsi="Arial" w:cs="Arial"/>
+          <w:b/>
+          <w:bCs/>
+          <w:color w:val="242424"/>
+          <w:sz w:val="20"/>
+          <w:szCs w:val="20"/>
+          <w:bdr w:val="none" w:sz="0" w:space="0" w:color="auto" w:frame="1"/>
+        </w:rPr>
+        <w:t>NGO reports – to be gathered</w:t>
+      </w:r>
+    </w:p>
+    <w:p>
+      <w:pPr>
+        <w:pStyle w:val="NormalWeb"/>
+        <w:spacing w:before="0" w:beforeAutospacing="0" w:after="0" w:afterAutospacing="0"/>
+        <w:ind w:left="1440"/>
+        <w:rPr>
+          <w:rFonts w:ascii="Arial" w:hAnsi="Arial" w:cs="Arial"/>
+          <w:b/>
+          <w:bCs/>
+          <w:color w:val="242424"/>
+          <w:sz w:val="20"/>
+          <w:szCs w:val="20"/>
+          <w:bdr w:val="none" w:sz="0" w:space="0" w:color="auto" w:frame="1"/>
+        </w:rPr>
+      </w:pPr>
+      <w:r>
+        <w:rPr>
+          <w:rFonts w:ascii="Arial" w:hAnsi="Arial" w:cs="Arial"/>
+          <w:b/>
+          <w:bCs/>
+          <w:color w:val="242424"/>
+          <w:sz w:val="20"/>
+          <w:szCs w:val="20"/>
+          <w:bdr w:val="none" w:sz="0" w:space="0" w:color="auto" w:frame="1"/>
+        </w:rPr>
+        <w:t>GDP data – to be gathered (</w:t>
+      </w:r>
+      <w:r>
+        <w:rPr>
+          <w:rFonts w:ascii="Arial" w:hAnsi="Arial" w:cs="Arial"/>
+          <w:b/>
+          <w:bCs/>
+          <w:color w:val="242424"/>
+          <w:sz w:val="20"/>
+          <w:szCs w:val="20"/>
+          <w:bdr w:val="none" w:sz="0" w:space="0" w:color="auto" w:frame="1"/>
+        </w:rPr>
+        <w:t xml:space="preserve">to </w:t>
+      </w:r>
+      <w:r>
+        <w:rPr>
+          <w:rFonts w:ascii="Arial" w:hAnsi="Arial" w:cs="Arial"/>
+          <w:b/>
+          <w:bCs/>
+          <w:color w:val="242424"/>
+          <w:sz w:val="20"/>
+          <w:szCs w:val="20"/>
+          <w:bdr w:val="none" w:sz="0" w:space="0" w:color="auto" w:frame="1"/>
+        </w:rPr>
+        <w:t>check literature)</w:t>
+      </w:r>
+    </w:p>
+    <w:p>
+      <w:pPr>
+        <w:pStyle w:val="NormalWeb"/>
         <w:numPr>
           <w:ilvl w:val="0"/>
-          <w:numId w:val="1"/>
+          <w:numId w:val="27"/>
         </w:numPr>
+        <w:spacing w:after="0"/>
+        <w:rPr>
+          <w:rFonts w:ascii="Arial" w:hAnsi="Arial" w:cs="Arial"/>
+          <w:color w:val="242424"/>
+          <w:sz w:val="20"/>
+          <w:szCs w:val="20"/>
+        </w:rPr>
+      </w:pPr>
+      <w:r>
+        <w:rPr>
+          <w:rFonts w:ascii="Arial" w:hAnsi="Arial" w:cs="Arial"/>
+          <w:color w:val="242424"/>
+          <w:sz w:val="20"/>
+          <w:szCs w:val="20"/>
+        </w:rPr>
+        <w:t>Wang et al (2</w:t>
+      </w:r>
+      <w:r>
+        <w:rPr>
+          <w:rFonts w:ascii="Arial" w:hAnsi="Arial" w:cs="Arial"/>
+          <w:color w:val="242424"/>
+          <w:sz w:val="20"/>
+          <w:szCs w:val="20"/>
+        </w:rPr>
+        <w:t>02</w:t>
+      </w:r>
+      <w:proofErr w:type="gramStart"/>
+      <w:r>
+        <w:rPr>
+          <w:rFonts w:ascii="Arial" w:hAnsi="Arial" w:cs="Arial"/>
+          <w:color w:val="242424"/>
+          <w:sz w:val="20"/>
+          <w:szCs w:val="20"/>
+        </w:rPr>
+        <w:t xml:space="preserve">)  </w:t>
+      </w:r>
+      <w:r>
+        <w:rPr>
+          <w:rFonts w:ascii="Arial" w:hAnsi="Arial" w:cs="Arial"/>
+          <w:color w:val="242424"/>
+          <w:sz w:val="20"/>
+          <w:szCs w:val="20"/>
+        </w:rPr>
+        <w:t>Socioeconomic</w:t>
+      </w:r>
+      <w:proofErr w:type="gramEnd"/>
+      <w:r>
+        <w:rPr>
+          <w:rFonts w:ascii="Arial" w:hAnsi="Arial" w:cs="Arial"/>
+          <w:color w:val="242424"/>
+          <w:sz w:val="20"/>
+          <w:szCs w:val="20"/>
+        </w:rPr>
+        <w:t xml:space="preserve"> Drivers of Post-Rainstorm Community Resilience: A</w:t>
+      </w:r>
+      <w:r>
+        <w:rPr>
+          <w:rFonts w:ascii="Arial" w:hAnsi="Arial" w:cs="Arial"/>
+          <w:color w:val="242424"/>
+          <w:sz w:val="20"/>
+          <w:szCs w:val="20"/>
+        </w:rPr>
+        <w:t xml:space="preserve"> </w:t>
+      </w:r>
+      <w:r>
+        <w:rPr>
+          <w:rFonts w:ascii="Arial" w:hAnsi="Arial" w:cs="Arial"/>
+          <w:color w:val="242424"/>
+          <w:sz w:val="20"/>
+          <w:szCs w:val="20"/>
+        </w:rPr>
+        <w:t>comparative analysis of two cases in</w:t>
+      </w:r>
+      <w:r>
+        <w:rPr>
+          <w:rFonts w:ascii="Arial" w:hAnsi="Arial" w:cs="Arial"/>
+          <w:color w:val="242424"/>
+          <w:sz w:val="20"/>
+          <w:szCs w:val="20"/>
+        </w:rPr>
+        <w:t xml:space="preserve"> </w:t>
+      </w:r>
+      <w:r>
+        <w:rPr>
+          <w:rFonts w:ascii="Arial" w:hAnsi="Arial" w:cs="Arial"/>
+          <w:color w:val="242424"/>
+          <w:sz w:val="20"/>
+          <w:szCs w:val="20"/>
+        </w:rPr>
+        <w:t>North Chin</w:t>
+      </w:r>
+      <w:r>
+        <w:rPr>
+          <w:rFonts w:ascii="Arial" w:hAnsi="Arial" w:cs="Arial"/>
+          <w:color w:val="242424"/>
+          <w:sz w:val="20"/>
+          <w:szCs w:val="20"/>
+        </w:rPr>
+        <w:t xml:space="preserve">a </w:t>
+      </w:r>
+    </w:p>
+    <w:p>
+      <w:pPr>
+        <w:pStyle w:val="NormalWeb"/>
+        <w:spacing w:before="0" w:beforeAutospacing="0" w:after="0" w:afterAutospacing="0"/>
+        <w:ind w:left="1440"/>
+        <w:rPr>
+          <w:rFonts w:ascii="Arial" w:hAnsi="Arial" w:cs="Arial"/>
+          <w:b/>
+          <w:bCs/>
+          <w:color w:val="242424"/>
+          <w:sz w:val="20"/>
+          <w:szCs w:val="20"/>
+        </w:rPr>
+      </w:pPr>
+      <w:r>
+        <w:rPr>
+          <w:rFonts w:ascii="Arial" w:hAnsi="Arial" w:cs="Arial"/>
+          <w:color w:val="242424"/>
+          <w:sz w:val="20"/>
+          <w:szCs w:val="20"/>
+          <w:bdr w:val="none" w:sz="0" w:space="0" w:color="auto" w:frame="1"/>
+        </w:rPr>
+        <w:t>It focuses on China and rainstorms, and while the approach around recovery type/speed clustering and</w:t>
+      </w:r>
+      <w:r>
+        <w:rPr>
+          <w:rStyle w:val="apple-converted-space"/>
+          <w:rFonts w:ascii="Arial" w:hAnsi="Arial" w:cs="Arial"/>
+          <w:color w:val="242424"/>
+          <w:sz w:val="20"/>
+          <w:szCs w:val="20"/>
+          <w:bdr w:val="none" w:sz="0" w:space="0" w:color="auto" w:frame="1"/>
+        </w:rPr>
+        <w:t> </w:t>
+      </w:r>
+      <w:r>
+        <w:rPr>
+          <w:rFonts w:ascii="Arial" w:hAnsi="Arial" w:cs="Arial"/>
+          <w:color w:val="242424"/>
+          <w:sz w:val="20"/>
+          <w:szCs w:val="20"/>
+          <w:bdr w:val="none" w:sz="0" w:space="0" w:color="auto" w:frame="1"/>
+        </w:rPr>
+        <w:t>multinomial logistic regression</w:t>
+      </w:r>
+      <w:r>
+        <w:rPr>
+          <w:rStyle w:val="apple-converted-space"/>
+          <w:rFonts w:ascii="Arial" w:hAnsi="Arial" w:cs="Arial"/>
+          <w:color w:val="242424"/>
+          <w:sz w:val="20"/>
+          <w:szCs w:val="20"/>
+          <w:bdr w:val="none" w:sz="0" w:space="0" w:color="auto" w:frame="1"/>
+        </w:rPr>
+        <w:t> </w:t>
+      </w:r>
+      <w:r>
+        <w:rPr>
+          <w:rFonts w:ascii="Arial" w:hAnsi="Arial" w:cs="Arial"/>
+          <w:color w:val="242424"/>
+          <w:sz w:val="20"/>
+          <w:szCs w:val="20"/>
+          <w:bdr w:val="none" w:sz="0" w:space="0" w:color="auto" w:frame="1"/>
+        </w:rPr>
+        <w:t xml:space="preserve">is quite well done, also here the </w:t>
+      </w:r>
+      <w:r>
+        <w:rPr>
+          <w:rFonts w:ascii="Arial" w:hAnsi="Arial" w:cs="Arial"/>
+          <w:b/>
+          <w:bCs/>
+          <w:color w:val="242424"/>
+          <w:sz w:val="20"/>
+          <w:szCs w:val="20"/>
+          <w:bdr w:val="none" w:sz="0" w:space="0" w:color="auto" w:frame="1"/>
+        </w:rPr>
+        <w:t>assumption is perfect linearity</w:t>
+      </w:r>
+      <w:r>
+        <w:rPr>
+          <w:rFonts w:ascii="Arial" w:hAnsi="Arial" w:cs="Arial"/>
+          <w:color w:val="242424"/>
+          <w:sz w:val="20"/>
+          <w:szCs w:val="20"/>
+          <w:bdr w:val="none" w:sz="0" w:space="0" w:color="auto" w:frame="1"/>
+        </w:rPr>
+        <w:t xml:space="preserve">. For disaster events in China where recovery (or at least electricity restoration) is fast that may well hold true. Again, looking at events like Haiyan or other disasters that strongly change the socio-economic fabric during a recovery period of multiple years we should be trying to understand </w:t>
+      </w:r>
+      <w:r>
+        <w:rPr>
+          <w:rFonts w:ascii="Arial" w:hAnsi="Arial" w:cs="Arial"/>
+          <w:b/>
+          <w:bCs/>
+          <w:color w:val="242424"/>
+          <w:sz w:val="20"/>
+          <w:szCs w:val="20"/>
+          <w:bdr w:val="none" w:sz="0" w:space="0" w:color="auto" w:frame="1"/>
+        </w:rPr>
+        <w:t>how the actual underlying light emission changes</w:t>
+      </w:r>
+      <w:r>
+        <w:rPr>
+          <w:rFonts w:ascii="Arial" w:hAnsi="Arial" w:cs="Arial"/>
+          <w:color w:val="242424"/>
+          <w:sz w:val="20"/>
+          <w:szCs w:val="20"/>
+          <w:bdr w:val="none" w:sz="0" w:space="0" w:color="auto" w:frame="1"/>
+        </w:rPr>
+        <w:t xml:space="preserve">, and why – to me </w:t>
+      </w:r>
+      <w:r>
+        <w:rPr>
+          <w:rFonts w:ascii="Arial" w:hAnsi="Arial" w:cs="Arial"/>
+          <w:b/>
+          <w:bCs/>
+          <w:color w:val="242424"/>
+          <w:sz w:val="20"/>
+          <w:szCs w:val="20"/>
+          <w:bdr w:val="none" w:sz="0" w:space="0" w:color="auto" w:frame="1"/>
+        </w:rPr>
+        <w:t>it’s the best research opening.</w:t>
+      </w:r>
+    </w:p>
+    <w:p>
+      <w:pPr>
         <w:spacing w:after="0" w:line="240" w:lineRule="auto"/>
-        <w:rPr>
-          <w:rFonts w:ascii="Arial" w:eastAsia="Times New Roman" w:hAnsi="Arial" w:cs="Arial"/>
-          <w:color w:val="000000" w:themeColor="text1"/>
-          <w:kern w:val="0"/>
-          <w:sz w:val="20"/>
-          <w:szCs w:val="20"/>
-          <w:highlight w:val="yellow"/>
-          <w:lang w:eastAsia="en-GB"/>
-          <w14:ligatures w14:val="none"/>
-        </w:rPr>
-      </w:pPr>
+        <w:ind w:left="720"/>
+        <w:rPr>
+          <w:color w:val="000000"/>
+        </w:rPr>
+      </w:pPr>
+    </w:p>
+    <w:p>
+      <w:pPr>
+        <w:spacing w:after="0" w:line="240" w:lineRule="auto"/>
+        <w:ind w:left="720"/>
+        <w:rPr>
+          <w:rFonts w:ascii="Arial" w:hAnsi="Arial" w:cs="Arial"/>
+          <w:color w:val="000000"/>
+        </w:rPr>
+      </w:pPr>
+      <w:r>
+        <w:rPr>
+          <w:rFonts w:ascii="Arial" w:hAnsi="Arial" w:cs="Arial"/>
+          <w:color w:val="000000"/>
+        </w:rPr>
+        <w:tab/>
+      </w:r>
+      <w:r>
+        <w:rPr>
+          <w:rFonts w:ascii="Arial" w:hAnsi="Arial" w:cs="Arial"/>
+          <w:color w:val="000000"/>
+        </w:rPr>
+        <w:t>Not assuming linearity and d</w:t>
+      </w:r>
+      <w:r>
+        <w:rPr>
+          <w:rFonts w:ascii="Arial" w:hAnsi="Arial" w:cs="Arial"/>
+          <w:color w:val="000000"/>
+        </w:rPr>
+        <w:t>isaggregating the baseline</w:t>
+      </w:r>
+      <w:r>
+        <w:rPr>
+          <w:rFonts w:ascii="Arial" w:hAnsi="Arial" w:cs="Arial"/>
+          <w:color w:val="000000"/>
+        </w:rPr>
+        <w:t xml:space="preserve"> is a promising</w:t>
+      </w:r>
+      <w:r>
+        <w:rPr>
+          <w:rFonts w:ascii="Arial" w:hAnsi="Arial" w:cs="Arial"/>
+          <w:color w:val="000000"/>
+        </w:rPr>
+        <w:t xml:space="preserve"> aspect and research indeed, multiple studies have tried disaggregating NTL signal into the trend/seasonality and attribute it to known </w:t>
+      </w:r>
+      <w:r>
+        <w:rPr>
+          <w:rFonts w:ascii="Arial" w:hAnsi="Arial" w:cs="Arial"/>
+          <w:color w:val="000000"/>
+        </w:rPr>
+        <w:t>phenomena (NTL on taal)</w:t>
+      </w:r>
+      <w:r>
+        <w:rPr>
+          <w:rFonts w:ascii="Arial" w:hAnsi="Arial" w:cs="Arial"/>
+          <w:color w:val="000000"/>
+        </w:rPr>
+        <w:t>. There are also ML based technics that learns the city-</w:t>
+      </w:r>
+      <w:r>
+        <w:rPr>
+          <w:rFonts w:ascii="Arial" w:hAnsi="Arial" w:cs="Arial"/>
+          <w:color w:val="000000"/>
+        </w:rPr>
+        <w:t>specific signatures (</w:t>
+      </w:r>
       <w:proofErr w:type="spellStart"/>
       <w:r>
         <w:rPr>
-          <w:rFonts w:ascii="Arial" w:eastAsia="Times New Roman" w:hAnsi="Arial" w:cs="Arial"/>
-          <w:color w:val="000000" w:themeColor="text1"/>
-          <w:kern w:val="0"/>
-          <w:sz w:val="20"/>
-          <w:szCs w:val="20"/>
-          <w:highlight w:val="yellow"/>
-          <w:bdr w:val="none" w:sz="0" w:space="0" w:color="auto" w:frame="1"/>
-          <w:lang w:eastAsia="en-GB"/>
-          <w14:ligatures w14:val="none"/>
-        </w:rPr>
-        <w:t>Ghaffarian</w:t>
+          <w:rFonts w:ascii="Arial" w:hAnsi="Arial" w:cs="Arial"/>
+          <w:color w:val="000000"/>
+        </w:rPr>
+        <w:t>chakborty</w:t>
       </w:r>
       <w:proofErr w:type="spellEnd"/>
       <w:r>
         <w:rPr>
-          <w:rFonts w:ascii="Arial" w:eastAsia="Times New Roman" w:hAnsi="Arial" w:cs="Arial"/>
-          <w:color w:val="000000" w:themeColor="text1"/>
-          <w:kern w:val="0"/>
-          <w:sz w:val="20"/>
-          <w:szCs w:val="20"/>
-          <w:highlight w:val="yellow"/>
-          <w:bdr w:val="none" w:sz="0" w:space="0" w:color="auto" w:frame="1"/>
-          <w:lang w:eastAsia="en-GB"/>
-          <w14:ligatures w14:val="none"/>
-        </w:rPr>
-        <w:t>, S., Roy, D., Filatova, T. &amp; Kerle, N. (2021) Agent-based modelling of post-disaster recovery with remote sensing data. Computers, Environment and Urban Systems, 60, 15 p.</w:t>
-      </w:r>
-    </w:p>
-    <w:p>
-      <w:pPr>
-        <w:numPr>
-          <w:ilvl w:val="0"/>
-          <w:numId w:val="1"/>
-        </w:numPr>
-        <w:spacing w:after="0" w:line="240" w:lineRule="auto"/>
-        <w:rPr>
-          <w:rFonts w:ascii="Arial" w:eastAsia="Times New Roman" w:hAnsi="Arial" w:cs="Arial"/>
-          <w:color w:val="000000" w:themeColor="text1"/>
-          <w:kern w:val="0"/>
-          <w:sz w:val="20"/>
-          <w:szCs w:val="20"/>
-          <w:highlight w:val="yellow"/>
-          <w:lang w:eastAsia="en-GB"/>
-          <w14:ligatures w14:val="none"/>
-        </w:rPr>
-      </w:pPr>
-      <w:proofErr w:type="spellStart"/>
-      <w:r>
-        <w:rPr>
-          <w:rFonts w:ascii="Arial" w:eastAsia="Times New Roman" w:hAnsi="Arial" w:cs="Arial"/>
-          <w:color w:val="000000" w:themeColor="text1"/>
-          <w:kern w:val="0"/>
-          <w:sz w:val="20"/>
-          <w:szCs w:val="20"/>
-          <w:highlight w:val="yellow"/>
-          <w:bdr w:val="none" w:sz="0" w:space="0" w:color="auto" w:frame="1"/>
-          <w:lang w:eastAsia="en-GB"/>
-          <w14:ligatures w14:val="none"/>
-        </w:rPr>
-        <w:t>Ghaffarian</w:t>
-      </w:r>
-      <w:proofErr w:type="spellEnd"/>
-      <w:r>
-        <w:rPr>
-          <w:rFonts w:ascii="Arial" w:eastAsia="Times New Roman" w:hAnsi="Arial" w:cs="Arial"/>
-          <w:color w:val="000000" w:themeColor="text1"/>
-          <w:kern w:val="0"/>
-          <w:sz w:val="20"/>
-          <w:szCs w:val="20"/>
-          <w:highlight w:val="yellow"/>
-          <w:bdr w:val="none" w:sz="0" w:space="0" w:color="auto" w:frame="1"/>
-          <w:lang w:eastAsia="en-GB"/>
-          <w14:ligatures w14:val="none"/>
-        </w:rPr>
-        <w:t xml:space="preserve">, S., </w:t>
-      </w:r>
-      <w:proofErr w:type="spellStart"/>
-      <w:r>
-        <w:rPr>
-          <w:rFonts w:ascii="Arial" w:eastAsia="Times New Roman" w:hAnsi="Arial" w:cs="Arial"/>
-          <w:color w:val="000000" w:themeColor="text1"/>
-          <w:kern w:val="0"/>
-          <w:sz w:val="20"/>
-          <w:szCs w:val="20"/>
-          <w:highlight w:val="yellow"/>
-          <w:bdr w:val="none" w:sz="0" w:space="0" w:color="auto" w:frame="1"/>
-          <w:lang w:eastAsia="en-GB"/>
-          <w14:ligatures w14:val="none"/>
-        </w:rPr>
-        <w:t>Farhadabad</w:t>
-      </w:r>
-      <w:proofErr w:type="spellEnd"/>
-      <w:r>
-        <w:rPr>
-          <w:rFonts w:ascii="Arial" w:eastAsia="Times New Roman" w:hAnsi="Arial" w:cs="Arial"/>
-          <w:color w:val="000000" w:themeColor="text1"/>
-          <w:kern w:val="0"/>
-          <w:sz w:val="20"/>
-          <w:szCs w:val="20"/>
-          <w:highlight w:val="yellow"/>
-          <w:bdr w:val="none" w:sz="0" w:space="0" w:color="auto" w:frame="1"/>
-          <w:lang w:eastAsia="en-GB"/>
-          <w14:ligatures w14:val="none"/>
-        </w:rPr>
-        <w:t>, A.R. &amp; Kerle, N. (2020) Post-disaster recovery monitoring with Google Earth Engine. International Journal of Geo-Information, 10(13), 4574.</w:t>
-      </w:r>
-    </w:p>
-    <w:p>
-      <w:pPr>
-        <w:numPr>
-          <w:ilvl w:val="0"/>
-          <w:numId w:val="1"/>
-        </w:numPr>
-        <w:spacing w:after="0" w:line="240" w:lineRule="auto"/>
-        <w:rPr>
-          <w:rFonts w:ascii="Arial" w:eastAsia="Times New Roman" w:hAnsi="Arial" w:cs="Arial"/>
-          <w:color w:val="000000" w:themeColor="text1"/>
-          <w:kern w:val="0"/>
-          <w:sz w:val="20"/>
-          <w:szCs w:val="20"/>
-          <w:highlight w:val="yellow"/>
-          <w:lang w:eastAsia="en-GB"/>
-          <w14:ligatures w14:val="none"/>
-        </w:rPr>
-      </w:pPr>
-      <w:proofErr w:type="spellStart"/>
-      <w:r>
-        <w:rPr>
-          <w:rFonts w:ascii="Arial" w:eastAsia="Times New Roman" w:hAnsi="Arial" w:cs="Arial"/>
-          <w:color w:val="000000" w:themeColor="text1"/>
-          <w:kern w:val="0"/>
-          <w:sz w:val="20"/>
-          <w:szCs w:val="20"/>
-          <w:highlight w:val="yellow"/>
-          <w:bdr w:val="none" w:sz="0" w:space="0" w:color="auto" w:frame="1"/>
-          <w:lang w:eastAsia="en-GB"/>
-          <w14:ligatures w14:val="none"/>
-        </w:rPr>
-        <w:t>Ghaffarian</w:t>
-      </w:r>
-      <w:proofErr w:type="spellEnd"/>
-      <w:r>
-        <w:rPr>
-          <w:rFonts w:ascii="Arial" w:eastAsia="Times New Roman" w:hAnsi="Arial" w:cs="Arial"/>
-          <w:color w:val="000000" w:themeColor="text1"/>
-          <w:kern w:val="0"/>
-          <w:sz w:val="20"/>
-          <w:szCs w:val="20"/>
-          <w:highlight w:val="yellow"/>
-          <w:bdr w:val="none" w:sz="0" w:space="0" w:color="auto" w:frame="1"/>
-          <w:lang w:eastAsia="en-GB"/>
-          <w14:ligatures w14:val="none"/>
-        </w:rPr>
-        <w:t xml:space="preserve">, S., Kerle, N., </w:t>
-      </w:r>
-      <w:proofErr w:type="spellStart"/>
-      <w:r>
-        <w:rPr>
-          <w:rFonts w:ascii="Arial" w:eastAsia="Times New Roman" w:hAnsi="Arial" w:cs="Arial"/>
-          <w:color w:val="000000" w:themeColor="text1"/>
-          <w:kern w:val="0"/>
-          <w:sz w:val="20"/>
-          <w:szCs w:val="20"/>
-          <w:highlight w:val="yellow"/>
-          <w:bdr w:val="none" w:sz="0" w:space="0" w:color="auto" w:frame="1"/>
-          <w:lang w:eastAsia="en-GB"/>
-          <w14:ligatures w14:val="none"/>
-        </w:rPr>
-        <w:t>Pasolli</w:t>
-      </w:r>
-      <w:proofErr w:type="spellEnd"/>
-      <w:r>
-        <w:rPr>
-          <w:rFonts w:ascii="Arial" w:eastAsia="Times New Roman" w:hAnsi="Arial" w:cs="Arial"/>
-          <w:color w:val="000000" w:themeColor="text1"/>
-          <w:kern w:val="0"/>
-          <w:sz w:val="20"/>
-          <w:szCs w:val="20"/>
-          <w:highlight w:val="yellow"/>
-          <w:bdr w:val="none" w:sz="0" w:space="0" w:color="auto" w:frame="1"/>
-          <w:lang w:eastAsia="en-GB"/>
-          <w14:ligatures w14:val="none"/>
-        </w:rPr>
-        <w:t xml:space="preserve">, E. &amp; Jokar Arsanjani, J. (2019) Post-disaster building database updating using automated deep learning with pre-disaster </w:t>
-      </w:r>
-      <w:proofErr w:type="spellStart"/>
-      <w:r>
-        <w:rPr>
-          <w:rFonts w:ascii="Arial" w:eastAsia="Times New Roman" w:hAnsi="Arial" w:cs="Arial"/>
-          <w:color w:val="000000" w:themeColor="text1"/>
-          <w:kern w:val="0"/>
-          <w:sz w:val="20"/>
-          <w:szCs w:val="20"/>
-          <w:highlight w:val="yellow"/>
-          <w:bdr w:val="none" w:sz="0" w:space="0" w:color="auto" w:frame="1"/>
-          <w:lang w:eastAsia="en-GB"/>
-          <w14:ligatures w14:val="none"/>
-        </w:rPr>
-        <w:t>Openstreetmap</w:t>
-      </w:r>
-      <w:proofErr w:type="spellEnd"/>
-      <w:r>
-        <w:rPr>
-          <w:rFonts w:ascii="Arial" w:eastAsia="Times New Roman" w:hAnsi="Arial" w:cs="Arial"/>
-          <w:color w:val="000000" w:themeColor="text1"/>
-          <w:kern w:val="0"/>
-          <w:sz w:val="20"/>
-          <w:szCs w:val="20"/>
-          <w:highlight w:val="yellow"/>
-          <w:bdr w:val="none" w:sz="0" w:space="0" w:color="auto" w:frame="1"/>
-          <w:lang w:eastAsia="en-GB"/>
-          <w14:ligatures w14:val="none"/>
-        </w:rPr>
-        <w:t xml:space="preserve"> and multi-temporal satellite data. Remote Sensing, 11(20), 2427.</w:t>
-      </w:r>
-    </w:p>
-    <w:p>
-      <w:pPr>
-        <w:numPr>
-          <w:ilvl w:val="0"/>
-          <w:numId w:val="1"/>
-        </w:numPr>
-        <w:spacing w:after="0" w:line="240" w:lineRule="auto"/>
-        <w:rPr>
-          <w:rFonts w:ascii="Arial" w:eastAsia="Times New Roman" w:hAnsi="Arial" w:cs="Arial"/>
-          <w:color w:val="000000" w:themeColor="text1"/>
-          <w:kern w:val="0"/>
-          <w:sz w:val="20"/>
-          <w:szCs w:val="20"/>
-          <w:highlight w:val="yellow"/>
-          <w:lang w:eastAsia="en-GB"/>
-          <w14:ligatures w14:val="none"/>
-        </w:rPr>
-      </w:pPr>
-      <w:proofErr w:type="spellStart"/>
-      <w:r>
-        <w:rPr>
-          <w:rFonts w:ascii="Arial" w:eastAsia="Times New Roman" w:hAnsi="Arial" w:cs="Arial"/>
-          <w:color w:val="000000" w:themeColor="text1"/>
-          <w:kern w:val="0"/>
-          <w:sz w:val="20"/>
-          <w:szCs w:val="20"/>
-          <w:highlight w:val="yellow"/>
-          <w:bdr w:val="none" w:sz="0" w:space="0" w:color="auto" w:frame="1"/>
-          <w:lang w:eastAsia="en-GB"/>
-          <w14:ligatures w14:val="none"/>
-        </w:rPr>
-        <w:t>Ghaffarian</w:t>
-      </w:r>
-      <w:proofErr w:type="spellEnd"/>
-      <w:r>
-        <w:rPr>
-          <w:rFonts w:ascii="Arial" w:eastAsia="Times New Roman" w:hAnsi="Arial" w:cs="Arial"/>
-          <w:color w:val="000000" w:themeColor="text1"/>
-          <w:kern w:val="0"/>
-          <w:sz w:val="20"/>
-          <w:szCs w:val="20"/>
-          <w:highlight w:val="yellow"/>
-          <w:bdr w:val="none" w:sz="0" w:space="0" w:color="auto" w:frame="1"/>
-          <w:lang w:eastAsia="en-GB"/>
-          <w14:ligatures w14:val="none"/>
-        </w:rPr>
-        <w:t>, S. &amp; Kerle, N. (2019) Towards post-disaster debris identification for precise damage and recovery assessments from UAV and satellite images. ISPRS Archives of the Photogrammetry, Remote Sensing and Spatial Information Sciences, 42(2/W13), 7 p.</w:t>
+          <w:rFonts w:ascii="Arial" w:hAnsi="Arial" w:cs="Arial"/>
+          <w:color w:val="000000"/>
+        </w:rPr>
+        <w:t xml:space="preserve"> paper), but they rely on gap-filled information to learn </w:t>
+      </w:r>
+      <w:proofErr w:type="gramStart"/>
+      <w:r>
+        <w:rPr>
+          <w:rFonts w:ascii="Arial" w:hAnsi="Arial" w:cs="Arial"/>
+          <w:color w:val="000000"/>
+        </w:rPr>
+        <w:t>these baseline behaviour</w:t>
+      </w:r>
+      <w:proofErr w:type="gramEnd"/>
+      <w:r>
+        <w:rPr>
+          <w:rFonts w:ascii="Arial" w:hAnsi="Arial" w:cs="Arial"/>
+          <w:color w:val="000000"/>
+        </w:rPr>
+        <w:t>. This means that this direction requires filling the gaps or making the data more complete</w:t>
+      </w:r>
+      <w:r>
+        <w:rPr>
+          <w:rFonts w:ascii="Arial" w:hAnsi="Arial" w:cs="Arial"/>
+          <w:color w:val="000000"/>
+        </w:rPr>
+        <w:t xml:space="preserve">, which is a paradox because in the context of short-term disaster impact assessment, we don’t want artificial data gaps to represent recovery. But this might be useful when looking at the long term recovery. </w:t>
       </w:r>
     </w:p>
     <w:p>
@@ -868,6 +2152,7 @@
           <w:szCs w:val="20"/>
           <w:lang w:val="en-US"/>
         </w:rPr>
+        <w:lastRenderedPageBreak/>
         <w:t>Observation Time: DMSP and VIIRS observe at different times of night, which can affect the type of economic activity captured.</w:t>
       </w:r>
     </w:p>
@@ -1013,7 +2298,6 @@
           <w:szCs w:val="20"/>
           <w:lang w:val="en-US"/>
         </w:rPr>
-        <w:lastRenderedPageBreak/>
         <w:t>For Researchers: Continued use of DMSP or harmonized DMSP-VIIRS data can lead to overestimation of disaster impacts, especially in spatial models. Researchers should prefer VIIRS data for post-2012 analyses and be cautious with harmonized datasets.</w:t>
       </w:r>
     </w:p>
@@ -1581,6 +2865,7 @@
           <w:sz w:val="20"/>
           <w:szCs w:val="20"/>
         </w:rPr>
+        <w:lastRenderedPageBreak/>
         <w:t>VIIRS data showed a decrease in upward radiance after the retrofit, suggesting the area was darker from the satellite's perspective.</w:t>
       </w:r>
     </w:p>
@@ -1702,7 +2987,6 @@
           <w:sz w:val="20"/>
           <w:szCs w:val="20"/>
         </w:rPr>
-        <w:lastRenderedPageBreak/>
         <w:t>Measurement Limitations:</w:t>
       </w:r>
       <w:r>
@@ -2488,10 +3772,7 @@
         <w:spacing w:line="276" w:lineRule="auto"/>
       </w:pPr>
       <w:r>
-        <w:t>R</w:t>
-      </w:r>
-      <w:r>
-        <w:t>esorts to high-quality adjacent pixels (Type 3) if neither Type 1 nor Type 2 are available.</w:t>
+        <w:t>Resorts to high-quality adjacent pixels (Type 3) if neither Type 1 nor Type 2 are available.</w:t>
       </w:r>
     </w:p>
     <w:p>
@@ -3541,13 +4822,7 @@
       </w:r>
       <w:proofErr w:type="spellEnd"/>
       <w:r>
-        <w:t xml:space="preserve"> approach: Used two photometers measuring light in five directions (upward, backward, forward, left, right) along Jerusalem routes at four time periods (21:15, 22:15, 23:15, 00:15</w:t>
-      </w:r>
-      <w:r>
-        <w:t>)</w:t>
-      </w:r>
-      <w:r>
-        <w:t>. Semi-rectangular polygons were created every 50m along routes for spatial comparison, with statistical analysis using Welch t-</w:t>
+        <w:t xml:space="preserve"> approach: Used two photometers measuring light in five directions (upward, backward, forward, left, right) along Jerusalem routes at four time periods (21:15, 22:15, 23:15, 00:15). Semi-rectangular polygons were created every 50m along routes for spatial comparison, with statistical analysis using Welch t-</w:t>
       </w:r>
       <w:proofErr w:type="gramStart"/>
       <w:r>
@@ -3584,13 +4859,7 @@
       </w:r>
       <w:proofErr w:type="gramEnd"/>
       <w:r>
-        <w:t xml:space="preserve"> turn-off policies in French villages after midnigh</w:t>
-      </w:r>
-      <w:r>
-        <w:t>t</w:t>
-      </w:r>
-      <w:r>
-        <w:t>.</w:t>
+        <w:t xml:space="preserve"> turn-off policies in French villages after midnight.</w:t>
       </w:r>
     </w:p>
     <w:p>
@@ -4285,7 +5554,7 @@
 </file>
 
 <file path=word/endnotes.xml><?xml version="1.0" encoding="utf-8"?>
-<w:endnotes xmlns:wpc="http://schemas.microsoft.com/office/word/2010/wordprocessingCanvas" xmlns:cx="http://schemas.microsoft.com/office/drawing/2014/chartex" xmlns:cx1="http://schemas.microsoft.com/office/drawing/2015/9/8/chartex" xmlns:cx2="http://schemas.microsoft.com/office/drawing/2015/10/21/chartex" xmlns:cx3="http://schemas.microsoft.com/office/drawing/2016/5/9/chartex" xmlns:cx4="http://schemas.microsoft.com/office/drawing/2016/5/10/chartex" xmlns:cx5="http://schemas.microsoft.com/office/drawing/2016/5/11/chartex" xmlns:cx6="http://schemas.microsoft.com/office/drawing/2016/5/12/chartex" xmlns:cx7="http://schemas.microsoft.com/office/drawing/2016/5/13/chartex" xmlns:cx8="http://schemas.microsoft.com/office/drawing/2016/5/14/chartex" xmlns:mc="http://schemas.openxmlformats.org/markup-compatibility/2006" xmlns:m="http://schemas.openxmlformats.org/officeDocument/2006/math" xmlns:aink="http://schemas.microsoft.com/office/drawing/2016/ink" xmlns:am3d="http://schemas.microsoft.com/office/drawing/2017/model3d" xmlns:oel="http://schemas.microsoft.com/office/2019/extlst" xmlns:r="http://schemas.openxmlformats.org/officeDocument/2006/relationships" xmlns:wp14="http://schemas.microsoft.com/office/word/2010/wordprocessingDrawing" xmlns:wp="http://schemas.openxmlformats.org/drawingml/2006/wordprocessingDrawing" xmlns:wpg="http://schemas.microsoft.com/office/word/2010/wordprocessingGroup" xmlns:wpi="http://schemas.microsoft.com/office/word/2010/wordprocessingInk" xmlns:wps="http://schemas.microsoft.com/office/word/2010/wordprocessingShape" xmlns:o="urn:schemas-microsoft-com:office:office" xmlns:v="urn:schemas-microsoft-com:vml" xmlns:w10="urn:schemas-microsoft-com:office:word" xmlns:w="http://schemas.openxmlformats.org/wordprocessingml/2006/main" xmlns:w14="http://schemas.microsoft.com/office/word/2010/wordml" xmlns:w15="http://schemas.microsoft.com/office/word/2012/wordml" xmlns:w16cex="http://schemas.microsoft.com/office/word/2018/wordml/cex" xmlns:w16cid="http://schemas.microsoft.com/office/word/2016/wordml/cid" xmlns:w16="http://schemas.microsoft.com/office/word/2018/wordml" xmlns:w16sdtdh="http://schemas.microsoft.com/office/word/2020/wordml/sdtdatahash" xmlns:w16sdtfl="http://schemas.microsoft.com/office/word/2024/wordml/sdtformatlock" xmlns:w16se="http://schemas.microsoft.com/office/word/2015/wordml/symex" xmlns:w16du="http://schemas.microsoft.com/office/word/2023/wordml/word16du" xmlns:wne="http://schemas.microsoft.com/office/word/2006/wordml" mc:Ignorable="w14 w15 w16se w16cid w16 w16cex w16sdtdh w16sdtfl w16du wp14">
+<w:endnotes xmlns:wpc="http://schemas.microsoft.com/office/word/2010/wordprocessingCanvas" xmlns:cx="http://schemas.microsoft.com/office/drawing/2014/chartex" xmlns:cx1="http://schemas.microsoft.com/office/drawing/2015/9/8/chartex" xmlns:cx2="http://schemas.microsoft.com/office/drawing/2015/10/21/chartex" xmlns:cx3="http://schemas.microsoft.com/office/drawing/2016/5/9/chartex" xmlns:cx4="http://schemas.microsoft.com/office/drawing/2016/5/10/chartex" xmlns:cx5="http://schemas.microsoft.com/office/drawing/2016/5/11/chartex" xmlns:cx6="http://schemas.microsoft.com/office/drawing/2016/5/12/chartex" xmlns:cx7="http://schemas.microsoft.com/office/drawing/2016/5/13/chartex" xmlns:cx8="http://schemas.microsoft.com/office/drawing/2016/5/14/chartex" xmlns:mc="http://schemas.openxmlformats.org/markup-compatibility/2006" xmlns:m="http://schemas.openxmlformats.org/officeDocument/2006/math" xmlns:aink="http://schemas.microsoft.com/office/drawing/2016/ink" xmlns:am3d="http://schemas.microsoft.com/office/drawing/2017/model3d" xmlns:oel="http://schemas.microsoft.com/office/2019/extlst" xmlns:r="http://schemas.openxmlformats.org/officeDocument/2006/relationships" xmlns:wp14="http://schemas.microsoft.com/office/word/2010/wordprocessingDrawing" xmlns:wp="http://schemas.openxmlformats.org/drawingml/2006/wordprocessingDrawing" xmlns:wpg="http://schemas.microsoft.com/office/word/2010/wordprocessingGroup" xmlns:wpi="http://schemas.microsoft.com/office/word/2010/wordprocessingInk" xmlns:wps="http://schemas.microsoft.com/office/word/2010/wordprocessingShape" xmlns:o="urn:schemas-microsoft-com:office:office" xmlns:v="urn:schemas-microsoft-com:vml" xmlns:w10="urn:schemas-microsoft-com:office:word" xmlns:w="http://schemas.openxmlformats.org/wordprocessingml/2006/main" xmlns:w14="http://schemas.microsoft.com/office/word/2010/wordml" xmlns:w15="http://schemas.microsoft.com/office/word/2012/wordml" xmlns:w16cei="http://schemas.microsoft.com/office/word/2026/wordml/cei" xmlns:w16cex="http://schemas.microsoft.com/office/word/2018/wordml/cex" xmlns:w16cid="http://schemas.microsoft.com/office/word/2016/wordml/cid" xmlns:w16="http://schemas.microsoft.com/office/word/2018/wordml" xmlns:w16sdtdh="http://schemas.microsoft.com/office/word/2020/wordml/sdtdatahash" xmlns:w16sdtfl="http://schemas.microsoft.com/office/word/2024/wordml/sdtformatlock" xmlns:w16se="http://schemas.microsoft.com/office/word/2015/wordml/symex" xmlns:w16du="http://schemas.microsoft.com/office/word/2023/wordml/word16du" xmlns:wne="http://schemas.microsoft.com/office/word/2006/wordml" mc:Ignorable="w14 w15 w16se w16cid w16 w16cex w16sdtdh w16sdtfl w16du wp14">
   <w:endnote w:type="separator" w:id="-1">
     <w:p>
       <w:pPr>
@@ -4310,7 +5579,7 @@
 </file>
 
 <file path=word/footnotes.xml><?xml version="1.0" encoding="utf-8"?>
-<w:footnotes xmlns:wpc="http://schemas.microsoft.com/office/word/2010/wordprocessingCanvas" xmlns:cx="http://schemas.microsoft.com/office/drawing/2014/chartex" xmlns:cx1="http://schemas.microsoft.com/office/drawing/2015/9/8/chartex" xmlns:cx2="http://schemas.microsoft.com/office/drawing/2015/10/21/chartex" xmlns:cx3="http://schemas.microsoft.com/office/drawing/2016/5/9/chartex" xmlns:cx4="http://schemas.microsoft.com/office/drawing/2016/5/10/chartex" xmlns:cx5="http://schemas.microsoft.com/office/drawing/2016/5/11/chartex" xmlns:cx6="http://schemas.microsoft.com/office/drawing/2016/5/12/chartex" xmlns:cx7="http://schemas.microsoft.com/office/drawing/2016/5/13/chartex" xmlns:cx8="http://schemas.microsoft.com/office/drawing/2016/5/14/chartex" xmlns:mc="http://schemas.openxmlformats.org/markup-compatibility/2006" xmlns:m="http://schemas.openxmlformats.org/officeDocument/2006/math" xmlns:aink="http://schemas.microsoft.com/office/drawing/2016/ink" xmlns:am3d="http://schemas.microsoft.com/office/drawing/2017/model3d" xmlns:oel="http://schemas.microsoft.com/office/2019/extlst" xmlns:r="http://schemas.openxmlformats.org/officeDocument/2006/relationships" xmlns:wp14="http://schemas.microsoft.com/office/word/2010/wordprocessingDrawing" xmlns:wp="http://schemas.openxmlformats.org/drawingml/2006/wordprocessingDrawing" xmlns:wpg="http://schemas.microsoft.com/office/word/2010/wordprocessingGroup" xmlns:wpi="http://schemas.microsoft.com/office/word/2010/wordprocessingInk" xmlns:wps="http://schemas.microsoft.com/office/word/2010/wordprocessingShape" xmlns:o="urn:schemas-microsoft-com:office:office" xmlns:v="urn:schemas-microsoft-com:vml" xmlns:w10="urn:schemas-microsoft-com:office:word" xmlns:w="http://schemas.openxmlformats.org/wordprocessingml/2006/main" xmlns:w14="http://schemas.microsoft.com/office/word/2010/wordml" xmlns:w15="http://schemas.microsoft.com/office/word/2012/wordml" xmlns:w16cex="http://schemas.microsoft.com/office/word/2018/wordml/cex" xmlns:w16cid="http://schemas.microsoft.com/office/word/2016/wordml/cid" xmlns:w16="http://schemas.microsoft.com/office/word/2018/wordml" xmlns:w16sdtdh="http://schemas.microsoft.com/office/word/2020/wordml/sdtdatahash" xmlns:w16sdtfl="http://schemas.microsoft.com/office/word/2024/wordml/sdtformatlock" xmlns:w16se="http://schemas.microsoft.com/office/word/2015/wordml/symex" xmlns:w16du="http://schemas.microsoft.com/office/word/2023/wordml/word16du" xmlns:wne="http://schemas.microsoft.com/office/word/2006/wordml" mc:Ignorable="w14 w15 w16se w16cid w16 w16cex w16sdtdh w16sdtfl w16du wp14">
+<w:footnotes xmlns:wpc="http://schemas.microsoft.com/office/word/2010/wordprocessingCanvas" xmlns:cx="http://schemas.microsoft.com/office/drawing/2014/chartex" xmlns:cx1="http://schemas.microsoft.com/office/drawing/2015/9/8/chartex" xmlns:cx2="http://schemas.microsoft.com/office/drawing/2015/10/21/chartex" xmlns:cx3="http://schemas.microsoft.com/office/drawing/2016/5/9/chartex" xmlns:cx4="http://schemas.microsoft.com/office/drawing/2016/5/10/chartex" xmlns:cx5="http://schemas.microsoft.com/office/drawing/2016/5/11/chartex" xmlns:cx6="http://schemas.microsoft.com/office/drawing/2016/5/12/chartex" xmlns:cx7="http://schemas.microsoft.com/office/drawing/2016/5/13/chartex" xmlns:cx8="http://schemas.microsoft.com/office/drawing/2016/5/14/chartex" xmlns:mc="http://schemas.openxmlformats.org/markup-compatibility/2006" xmlns:m="http://schemas.openxmlformats.org/officeDocument/2006/math" xmlns:aink="http://schemas.microsoft.com/office/drawing/2016/ink" xmlns:am3d="http://schemas.microsoft.com/office/drawing/2017/model3d" xmlns:oel="http://schemas.microsoft.com/office/2019/extlst" xmlns:r="http://schemas.openxmlformats.org/officeDocument/2006/relationships" xmlns:wp14="http://schemas.microsoft.com/office/word/2010/wordprocessingDrawing" xmlns:wp="http://schemas.openxmlformats.org/drawingml/2006/wordprocessingDrawing" xmlns:wpg="http://schemas.microsoft.com/office/word/2010/wordprocessingGroup" xmlns:wpi="http://schemas.microsoft.com/office/word/2010/wordprocessingInk" xmlns:wps="http://schemas.microsoft.com/office/word/2010/wordprocessingShape" xmlns:o="urn:schemas-microsoft-com:office:office" xmlns:v="urn:schemas-microsoft-com:vml" xmlns:w10="urn:schemas-microsoft-com:office:word" xmlns:w="http://schemas.openxmlformats.org/wordprocessingml/2006/main" xmlns:w14="http://schemas.microsoft.com/office/word/2010/wordml" xmlns:w15="http://schemas.microsoft.com/office/word/2012/wordml" xmlns:w16cei="http://schemas.microsoft.com/office/word/2026/wordml/cei" xmlns:w16cex="http://schemas.microsoft.com/office/word/2018/wordml/cex" xmlns:w16cid="http://schemas.microsoft.com/office/word/2016/wordml/cid" xmlns:w16="http://schemas.microsoft.com/office/word/2018/wordml" xmlns:w16sdtdh="http://schemas.microsoft.com/office/word/2020/wordml/sdtdatahash" xmlns:w16sdtfl="http://schemas.microsoft.com/office/word/2024/wordml/sdtformatlock" xmlns:w16se="http://schemas.microsoft.com/office/word/2015/wordml/symex" xmlns:w16du="http://schemas.microsoft.com/office/word/2023/wordml/word16du" xmlns:wne="http://schemas.microsoft.com/office/word/2006/wordml" mc:Ignorable="w14 w15 w16se w16cid w16 w16cex w16sdtdh w16sdtfl w16du wp14">
   <w:footnote w:type="separator" w:id="-1">
     <w:p>
       <w:pPr>
@@ -4335,7 +5604,7 @@
 </file>
 
 <file path=word/numbering.xml><?xml version="1.0" encoding="utf-8"?>
-<w:numbering xmlns:wpc="http://schemas.microsoft.com/office/word/2010/wordprocessingCanvas" xmlns:cx="http://schemas.microsoft.com/office/drawing/2014/chartex" xmlns:cx1="http://schemas.microsoft.com/office/drawing/2015/9/8/chartex" xmlns:cx2="http://schemas.microsoft.com/office/drawing/2015/10/21/chartex" xmlns:cx3="http://schemas.microsoft.com/office/drawing/2016/5/9/chartex" xmlns:cx4="http://schemas.microsoft.com/office/drawing/2016/5/10/chartex" xmlns:cx5="http://schemas.microsoft.com/office/drawing/2016/5/11/chartex" xmlns:cx6="http://schemas.microsoft.com/office/drawing/2016/5/12/chartex" xmlns:cx7="http://schemas.microsoft.com/office/drawing/2016/5/13/chartex" xmlns:cx8="http://schemas.microsoft.com/office/drawing/2016/5/14/chartex" xmlns:mc="http://schemas.openxmlformats.org/markup-compatibility/2006" xmlns:m="http://schemas.openxmlformats.org/officeDocument/2006/math" xmlns:aink="http://schemas.microsoft.com/office/drawing/2016/ink" xmlns:am3d="http://schemas.microsoft.com/office/drawing/2017/model3d" xmlns:oel="http://schemas.microsoft.com/office/2019/extlst" xmlns:r="http://schemas.openxmlformats.org/officeDocument/2006/relationships" xmlns:wp14="http://schemas.microsoft.com/office/word/2010/wordprocessingDrawing" xmlns:wp="http://schemas.openxmlformats.org/drawingml/2006/wordprocessingDrawing" xmlns:wpg="http://schemas.microsoft.com/office/word/2010/wordprocessingGroup" xmlns:wpi="http://schemas.microsoft.com/office/word/2010/wordprocessingInk" xmlns:wps="http://schemas.microsoft.com/office/word/2010/wordprocessingShape" xmlns:o="urn:schemas-microsoft-com:office:office" xmlns:v="urn:schemas-microsoft-com:vml" xmlns:w10="urn:schemas-microsoft-com:office:word" xmlns:w="http://schemas.openxmlformats.org/wordprocessingml/2006/main" xmlns:w14="http://schemas.microsoft.com/office/word/2010/wordml" xmlns:w15="http://schemas.microsoft.com/office/word/2012/wordml" xmlns:w16cex="http://schemas.microsoft.com/office/word/2018/wordml/cex" xmlns:w16cid="http://schemas.microsoft.com/office/word/2016/wordml/cid" xmlns:w16="http://schemas.microsoft.com/office/word/2018/wordml" xmlns:w16sdtdh="http://schemas.microsoft.com/office/word/2020/wordml/sdtdatahash" xmlns:w16sdtfl="http://schemas.microsoft.com/office/word/2024/wordml/sdtformatlock" xmlns:w16se="http://schemas.microsoft.com/office/word/2015/wordml/symex" xmlns:w16du="http://schemas.microsoft.com/office/word/2023/wordml/word16du" xmlns:wne="http://schemas.microsoft.com/office/word/2006/wordml" mc:Ignorable="w14 w15 w16se w16cid w16 w16cex w16sdtdh w16sdtfl w16du wp14">
+<w:numbering xmlns:wpc="http://schemas.microsoft.com/office/word/2010/wordprocessingCanvas" xmlns:cx="http://schemas.microsoft.com/office/drawing/2014/chartex" xmlns:cx1="http://schemas.microsoft.com/office/drawing/2015/9/8/chartex" xmlns:cx2="http://schemas.microsoft.com/office/drawing/2015/10/21/chartex" xmlns:cx3="http://schemas.microsoft.com/office/drawing/2016/5/9/chartex" xmlns:cx4="http://schemas.microsoft.com/office/drawing/2016/5/10/chartex" xmlns:cx5="http://schemas.microsoft.com/office/drawing/2016/5/11/chartex" xmlns:cx6="http://schemas.microsoft.com/office/drawing/2016/5/12/chartex" xmlns:cx7="http://schemas.microsoft.com/office/drawing/2016/5/13/chartex" xmlns:cx8="http://schemas.microsoft.com/office/drawing/2016/5/14/chartex" xmlns:mc="http://schemas.openxmlformats.org/markup-compatibility/2006" xmlns:m="http://schemas.openxmlformats.org/officeDocument/2006/math" xmlns:aink="http://schemas.microsoft.com/office/drawing/2016/ink" xmlns:am3d="http://schemas.microsoft.com/office/drawing/2017/model3d" xmlns:oel="http://schemas.microsoft.com/office/2019/extlst" xmlns:r="http://schemas.openxmlformats.org/officeDocument/2006/relationships" xmlns:wp14="http://schemas.microsoft.com/office/word/2010/wordprocessingDrawing" xmlns:wp="http://schemas.openxmlformats.org/drawingml/2006/wordprocessingDrawing" xmlns:wpg="http://schemas.microsoft.com/office/word/2010/wordprocessingGroup" xmlns:wpi="http://schemas.microsoft.com/office/word/2010/wordprocessingInk" xmlns:wps="http://schemas.microsoft.com/office/word/2010/wordprocessingShape" xmlns:o="urn:schemas-microsoft-com:office:office" xmlns:v="urn:schemas-microsoft-com:vml" xmlns:w10="urn:schemas-microsoft-com:office:word" xmlns:w="http://schemas.openxmlformats.org/wordprocessingml/2006/main" xmlns:w14="http://schemas.microsoft.com/office/word/2010/wordml" xmlns:w15="http://schemas.microsoft.com/office/word/2012/wordml" xmlns:w16cei="http://schemas.microsoft.com/office/word/2026/wordml/cei" xmlns:w16cex="http://schemas.microsoft.com/office/word/2018/wordml/cex" xmlns:w16cid="http://schemas.microsoft.com/office/word/2016/wordml/cid" xmlns:w16="http://schemas.microsoft.com/office/word/2018/wordml" xmlns:w16sdtdh="http://schemas.microsoft.com/office/word/2020/wordml/sdtdatahash" xmlns:w16sdtfl="http://schemas.microsoft.com/office/word/2024/wordml/sdtformatlock" xmlns:w16se="http://schemas.microsoft.com/office/word/2015/wordml/symex" xmlns:w16du="http://schemas.microsoft.com/office/word/2023/wordml/word16du" xmlns:wne="http://schemas.microsoft.com/office/word/2006/wordml" mc:Ignorable="w14 w15 w16se w16cid w16 w16cex w16sdtdh w16sdtfl w16du wp14">
   <w:abstractNum w:abstractNumId="0" w15:restartNumberingAfterBreak="0">
     <w:nsid w:val="FFFFFF88"/>
     <w:multiLevelType w:val="singleLevel"/>
@@ -5141,7 +6410,7 @@
         <w:rFonts w:ascii="Symbol" w:hAnsi="Symbol" w:hint="default"/>
       </w:rPr>
     </w:lvl>
-    <w:lvl w:ilvl="1" w:tplc="08090003" w:tentative="1">
+    <w:lvl w:ilvl="1" w:tplc="08090003">
       <w:start w:val="1"/>
       <w:numFmt w:val="bullet"/>
       <w:lvlText w:val="o"/>
@@ -7078,6 +8347,119 @@
     </w:lvl>
   </w:abstractNum>
   <w:abstractNum w:abstractNumId="25" w15:restartNumberingAfterBreak="0">
+    <w:nsid w:val="6D4130AA"/>
+    <w:multiLevelType w:val="hybridMultilevel"/>
+    <w:tmpl w:val="70947910"/>
+    <w:lvl w:ilvl="0" w:tplc="04090001">
+      <w:start w:val="1"/>
+      <w:numFmt w:val="bullet"/>
+      <w:lvlText w:val=""/>
+      <w:lvlJc w:val="left"/>
+      <w:pPr>
+        <w:ind w:left="1080" w:hanging="360"/>
+      </w:pPr>
+      <w:rPr>
+        <w:rFonts w:ascii="Symbol" w:hAnsi="Symbol" w:hint="default"/>
+      </w:rPr>
+    </w:lvl>
+    <w:lvl w:ilvl="1" w:tplc="04090003" w:tentative="1">
+      <w:start w:val="1"/>
+      <w:numFmt w:val="bullet"/>
+      <w:lvlText w:val="o"/>
+      <w:lvlJc w:val="left"/>
+      <w:pPr>
+        <w:ind w:left="1800" w:hanging="360"/>
+      </w:pPr>
+      <w:rPr>
+        <w:rFonts w:ascii="Courier New" w:hAnsi="Courier New" w:cs="Courier New" w:hint="default"/>
+      </w:rPr>
+    </w:lvl>
+    <w:lvl w:ilvl="2" w:tplc="04090005" w:tentative="1">
+      <w:start w:val="1"/>
+      <w:numFmt w:val="bullet"/>
+      <w:lvlText w:val=""/>
+      <w:lvlJc w:val="left"/>
+      <w:pPr>
+        <w:ind w:left="2520" w:hanging="360"/>
+      </w:pPr>
+      <w:rPr>
+        <w:rFonts w:ascii="Wingdings" w:hAnsi="Wingdings" w:hint="default"/>
+      </w:rPr>
+    </w:lvl>
+    <w:lvl w:ilvl="3" w:tplc="04090001" w:tentative="1">
+      <w:start w:val="1"/>
+      <w:numFmt w:val="bullet"/>
+      <w:lvlText w:val=""/>
+      <w:lvlJc w:val="left"/>
+      <w:pPr>
+        <w:ind w:left="3240" w:hanging="360"/>
+      </w:pPr>
+      <w:rPr>
+        <w:rFonts w:ascii="Symbol" w:hAnsi="Symbol" w:hint="default"/>
+      </w:rPr>
+    </w:lvl>
+    <w:lvl w:ilvl="4" w:tplc="04090003" w:tentative="1">
+      <w:start w:val="1"/>
+      <w:numFmt w:val="bullet"/>
+      <w:lvlText w:val="o"/>
+      <w:lvlJc w:val="left"/>
+      <w:pPr>
+        <w:ind w:left="3960" w:hanging="360"/>
+      </w:pPr>
+      <w:rPr>
+        <w:rFonts w:ascii="Courier New" w:hAnsi="Courier New" w:cs="Courier New" w:hint="default"/>
+      </w:rPr>
+    </w:lvl>
+    <w:lvl w:ilvl="5" w:tplc="04090005" w:tentative="1">
+      <w:start w:val="1"/>
+      <w:numFmt w:val="bullet"/>
+      <w:lvlText w:val=""/>
+      <w:lvlJc w:val="left"/>
+      <w:pPr>
+        <w:ind w:left="4680" w:hanging="360"/>
+      </w:pPr>
+      <w:rPr>
+        <w:rFonts w:ascii="Wingdings" w:hAnsi="Wingdings" w:hint="default"/>
+      </w:rPr>
+    </w:lvl>
+    <w:lvl w:ilvl="6" w:tplc="04090001" w:tentative="1">
+      <w:start w:val="1"/>
+      <w:numFmt w:val="bullet"/>
+      <w:lvlText w:val=""/>
+      <w:lvlJc w:val="left"/>
+      <w:pPr>
+        <w:ind w:left="5400" w:hanging="360"/>
+      </w:pPr>
+      <w:rPr>
+        <w:rFonts w:ascii="Symbol" w:hAnsi="Symbol" w:hint="default"/>
+      </w:rPr>
+    </w:lvl>
+    <w:lvl w:ilvl="7" w:tplc="04090003" w:tentative="1">
+      <w:start w:val="1"/>
+      <w:numFmt w:val="bullet"/>
+      <w:lvlText w:val="o"/>
+      <w:lvlJc w:val="left"/>
+      <w:pPr>
+        <w:ind w:left="6120" w:hanging="360"/>
+      </w:pPr>
+      <w:rPr>
+        <w:rFonts w:ascii="Courier New" w:hAnsi="Courier New" w:cs="Courier New" w:hint="default"/>
+      </w:rPr>
+    </w:lvl>
+    <w:lvl w:ilvl="8" w:tplc="04090005" w:tentative="1">
+      <w:start w:val="1"/>
+      <w:numFmt w:val="bullet"/>
+      <w:lvlText w:val=""/>
+      <w:lvlJc w:val="left"/>
+      <w:pPr>
+        <w:ind w:left="6840" w:hanging="360"/>
+      </w:pPr>
+      <w:rPr>
+        <w:rFonts w:ascii="Wingdings" w:hAnsi="Wingdings" w:hint="default"/>
+      </w:rPr>
+    </w:lvl>
+  </w:abstractNum>
+  <w:abstractNum w:abstractNumId="26" w15:restartNumberingAfterBreak="0">
     <w:nsid w:val="6F8B018B"/>
     <w:multiLevelType w:val="hybridMultilevel"/>
     <w:tmpl w:val="BE38E9A2"/>
@@ -7206,7 +8588,7 @@
     <w:abstractNumId w:val="9"/>
   </w:num>
   <w:num w:numId="6" w16cid:durableId="1478953833">
-    <w:abstractNumId w:val="25"/>
+    <w:abstractNumId w:val="26"/>
   </w:num>
   <w:num w:numId="7" w16cid:durableId="1759866222">
     <w:abstractNumId w:val="21"/>
@@ -7267,6 +8649,9 @@
   </w:num>
   <w:num w:numId="26" w16cid:durableId="563030934">
     <w:abstractNumId w:val="18"/>
+  </w:num>
+  <w:num w:numId="27" w16cid:durableId="757486836">
+    <w:abstractNumId w:val="25"/>
   </w:num>
   <w:numIdMacAtCleanup w:val="26"/>
 </w:numbering>

</xml_diff>